<commit_message>
Add main portal pages, login system, and admin editor
</commit_message>
<xml_diff>
--- a/EMS2/uploads/templates/BEEF-Temp.docx
+++ b/EMS2/uploads/templates/BEEF-Temp.docx
@@ -415,7 +415,7 @@
           <w:noProof/>
         </w:rPr>
         <w:drawing>
-          <wp:anchor distT="0" distB="0" distL="114300" distR="114300" simplePos="0" relativeHeight="251658240" behindDoc="0" locked="0" layoutInCell="1" allowOverlap="1" wp14:anchorId="727C2F13" wp14:editId="7E9C4885">
+          <wp:anchor distT="0" distB="0" distL="114300" distR="114300" simplePos="0" relativeHeight="251657216" behindDoc="0" locked="0" layoutInCell="1" allowOverlap="1" wp14:anchorId="727C2F13" wp14:editId="7D97C138">
             <wp:simplePos x="0" y="0"/>
             <wp:positionH relativeFrom="column">
               <wp:posOffset>-2540</wp:posOffset>
@@ -485,7 +485,7 @@
         <mc:AlternateContent>
           <mc:Choice Requires="wps">
             <w:drawing>
-              <wp:anchor distT="45720" distB="45720" distL="114300" distR="114300" simplePos="0" relativeHeight="251660288" behindDoc="0" locked="0" layoutInCell="1" allowOverlap="1" wp14:anchorId="147FD0E0" wp14:editId="64BA1E04">
+              <wp:anchor distT="45720" distB="45720" distL="114300" distR="114300" simplePos="0" relativeHeight="251659264" behindDoc="0" locked="0" layoutInCell="1" allowOverlap="1" wp14:anchorId="147FD0E0" wp14:editId="41DC8332">
                 <wp:simplePos x="0" y="0"/>
                 <wp:positionH relativeFrom="column">
                   <wp:posOffset>884199</wp:posOffset>
@@ -570,7 +570,7 @@
                 <v:stroke joinstyle="miter"/>
                 <v:path gradientshapeok="t" o:connecttype="rect"/>
               </v:shapetype>
-              <v:shape id="Text Box 2" o:spid="_x0000_s1026" type="#_x0000_t202" style="position:absolute;margin-left:69.6pt;margin-top:15.75pt;width:5in;height:32.9pt;z-index:251660288;visibility:visible;mso-wrap-style:square;mso-width-percent:0;mso-height-percent:0;mso-wrap-distance-left:9pt;mso-wrap-distance-top:3.6pt;mso-wrap-distance-right:9pt;mso-wrap-distance-bottom:3.6pt;mso-position-horizontal:absolute;mso-position-horizontal-relative:text;mso-position-vertical:absolute;mso-position-vertical-relative:text;mso-width-percent:0;mso-height-percent:0;mso-width-relative:margin;mso-height-relative:margin;v-text-anchor:top" o:gfxdata="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" stroked="f">
+              <v:shape id="Text Box 2" o:spid="_x0000_s1026" type="#_x0000_t202" style="position:absolute;margin-left:69.6pt;margin-top:15.75pt;width:5in;height:32.9pt;z-index:251659264;visibility:visible;mso-wrap-style:square;mso-width-percent:0;mso-height-percent:0;mso-wrap-distance-left:9pt;mso-wrap-distance-top:3.6pt;mso-wrap-distance-right:9pt;mso-wrap-distance-bottom:3.6pt;mso-position-horizontal:absolute;mso-position-horizontal-relative:text;mso-position-vertical:absolute;mso-position-vertical-relative:text;mso-width-percent:0;mso-height-percent:0;mso-width-relative:margin;mso-height-relative:margin;v-text-anchor:top" o:gfxdata="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" stroked="f">
                 <v:textbox>
                   <w:txbxContent>
                     <w:p>
@@ -609,7 +609,7 @@
         <mc:AlternateContent>
           <mc:Choice Requires="wps">
             <w:drawing>
-              <wp:anchor distT="45720" distB="45720" distL="114300" distR="114300" simplePos="0" relativeHeight="251663360" behindDoc="0" locked="0" layoutInCell="1" allowOverlap="1" wp14:anchorId="5C5CEDDC" wp14:editId="4F6B375F">
+              <wp:anchor distT="45720" distB="45720" distL="114300" distR="114300" simplePos="0" relativeHeight="251662336" behindDoc="0" locked="0" layoutInCell="1" allowOverlap="1" wp14:anchorId="5C5CEDDC" wp14:editId="351E9943">
                 <wp:simplePos x="0" y="0"/>
                 <wp:positionH relativeFrom="column">
                   <wp:posOffset>5486171</wp:posOffset>
@@ -618,7 +618,7 @@
                   <wp:posOffset>-163576</wp:posOffset>
                 </wp:positionV>
                 <wp:extent cx="1371600" cy="1371600"/>
-                <wp:effectExtent l="38100" t="38100" r="38100" b="38100"/>
+                <wp:effectExtent l="0" t="0" r="0" b="0"/>
                 <wp:wrapNone/>
                 <wp:docPr id="3" name="Text Box 2"/>
                 <wp:cNvGraphicFramePr>
@@ -642,9 +642,7 @@
                           <a:srgbClr val="FFFFFF"/>
                         </a:solidFill>
                         <a:ln w="76200">
-                          <a:solidFill>
-                            <a:srgbClr val="000000"/>
-                          </a:solidFill>
+                          <a:noFill/>
                           <a:miter lim="800000"/>
                           <a:headEnd/>
                           <a:tailEnd/>
@@ -685,7 +683,7 @@
           </mc:Choice>
           <mc:Fallback>
             <w:pict>
-              <v:shape w14:anchorId="5C5CEDDC" id="_x0000_s1027" type="#_x0000_t202" style="position:absolute;margin-left:6in;margin-top:-12.9pt;width:108pt;height:108pt;z-index:251663360;visibility:visible;mso-wrap-style:square;mso-width-percent:0;mso-height-percent:0;mso-wrap-distance-left:9pt;mso-wrap-distance-top:3.6pt;mso-wrap-distance-right:9pt;mso-wrap-distance-bottom:3.6pt;mso-position-horizontal:absolute;mso-position-horizontal-relative:text;mso-position-vertical:absolute;mso-position-vertical-relative:text;mso-width-percent:0;mso-height-percent:0;mso-width-relative:margin;mso-height-relative:margin;v-text-anchor:middle" o:gfxdata="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" strokeweight="6pt">
+              <v:shape w14:anchorId="5C5CEDDC" id="_x0000_s1027" type="#_x0000_t202" style="position:absolute;margin-left:6in;margin-top:-12.9pt;width:108pt;height:108pt;z-index:251662336;visibility:visible;mso-wrap-style:square;mso-width-percent:0;mso-height-percent:0;mso-wrap-distance-left:9pt;mso-wrap-distance-top:3.6pt;mso-wrap-distance-right:9pt;mso-wrap-distance-bottom:3.6pt;mso-position-horizontal:absolute;mso-position-horizontal-relative:text;mso-position-vertical:absolute;mso-position-vertical-relative:text;mso-width-percent:0;mso-height-percent:0;mso-width-relative:margin;mso-height-relative:margin;v-text-anchor:middle" o:gfxdata="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" stroked="f" strokeweight="6pt">
                 <v:textbox>
                   <w:txbxContent>
                     <w:p>
@@ -724,7 +722,7 @@
         <mc:AlternateContent>
           <mc:Choice Requires="wps">
             <w:drawing>
-              <wp:anchor distT="45720" distB="45720" distL="114300" distR="114300" simplePos="0" relativeHeight="251655168" behindDoc="0" locked="0" layoutInCell="1" allowOverlap="1" wp14:anchorId="3A3E1CED" wp14:editId="67F60A67">
+              <wp:anchor distT="45720" distB="45720" distL="114300" distR="114300" simplePos="0" relativeHeight="251654144" behindDoc="0" locked="0" layoutInCell="1" allowOverlap="1" wp14:anchorId="3A3E1CED" wp14:editId="5A475514">
                 <wp:simplePos x="0" y="0"/>
                 <wp:positionH relativeFrom="column">
                   <wp:posOffset>884199</wp:posOffset>
@@ -805,7 +803,7 @@
           </mc:Choice>
           <mc:Fallback>
             <w:pict>
-              <v:shape w14:anchorId="3A3E1CED" id="_x0000_s1028" type="#_x0000_t202" style="position:absolute;margin-left:69.6pt;margin-top:21.05pt;width:5in;height:30.5pt;z-index:251655168;visibility:visible;mso-wrap-style:square;mso-width-percent:0;mso-height-percent:0;mso-wrap-distance-left:9pt;mso-wrap-distance-top:3.6pt;mso-wrap-distance-right:9pt;mso-wrap-distance-bottom:3.6pt;mso-position-horizontal:absolute;mso-position-horizontal-relative:text;mso-position-vertical:absolute;mso-position-vertical-relative:text;mso-width-percent:0;mso-height-percent:0;mso-width-relative:margin;mso-height-relative:margin;v-text-anchor:top" o:gfxdata="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" stroked="f">
+              <v:shape w14:anchorId="3A3E1CED" id="_x0000_s1028" type="#_x0000_t202" style="position:absolute;margin-left:69.6pt;margin-top:21.05pt;width:5in;height:30.5pt;z-index:251654144;visibility:visible;mso-wrap-style:square;mso-width-percent:0;mso-height-percent:0;mso-wrap-distance-left:9pt;mso-wrap-distance-top:3.6pt;mso-wrap-distance-right:9pt;mso-wrap-distance-bottom:3.6pt;mso-position-horizontal:absolute;mso-position-horizontal-relative:text;mso-position-vertical:absolute;mso-position-vertical-relative:text;mso-width-percent:0;mso-height-percent:0;mso-width-relative:margin;mso-height-relative:margin;v-text-anchor:top" o:gfxdata="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" stroked="f">
                 <v:textbox>
                   <w:txbxContent>
                     <w:p>
@@ -858,7 +856,7 @@
         <mc:AlternateContent>
           <mc:Choice Requires="wps">
             <w:drawing>
-              <wp:anchor distT="45720" distB="45720" distL="114300" distR="114300" simplePos="0" relativeHeight="251662336" behindDoc="0" locked="0" layoutInCell="1" allowOverlap="1" wp14:anchorId="68D54235" wp14:editId="531E608F">
+              <wp:anchor distT="45720" distB="45720" distL="114300" distR="114300" simplePos="0" relativeHeight="251661312" behindDoc="0" locked="0" layoutInCell="1" allowOverlap="1" wp14:anchorId="68D54235" wp14:editId="43A1E6C3">
                 <wp:simplePos x="0" y="0"/>
                 <wp:positionH relativeFrom="column">
                   <wp:posOffset>113386</wp:posOffset>
@@ -923,15 +921,7 @@
                                 <w:szCs w:val="20"/>
                                 <w:lang w:val="en-US"/>
                               </w:rPr>
-                              <w:t xml:space="preserve"> </w:t>
-                            </w:r>
-                            <w:r>
-                              <w:rPr>
-                                <w:sz w:val="20"/>
-                                <w:szCs w:val="20"/>
-                                <w:lang w:val="en-US"/>
-                              </w:rPr>
-                              <w:t>Print legibly all information required in CAPITAL letters and ch</w:t>
+                              <w:t xml:space="preserve"> Print legibly all information required in CAPITAL letters and ch</w:t>
                             </w:r>
                             <w:r>
                               <w:rPr>
@@ -1011,7 +1001,7 @@
           </mc:Choice>
           <mc:Fallback>
             <w:pict>
-              <v:shape w14:anchorId="68D54235" id="_x0000_s1029" type="#_x0000_t202" style="position:absolute;margin-left:8.95pt;margin-top:11.85pt;width:388.2pt;height:36pt;z-index:251662336;visibility:visible;mso-wrap-style:square;mso-width-percent:0;mso-height-percent:0;mso-wrap-distance-left:9pt;mso-wrap-distance-top:3.6pt;mso-wrap-distance-right:9pt;mso-wrap-distance-bottom:3.6pt;mso-position-horizontal:absolute;mso-position-horizontal-relative:text;mso-position-vertical:absolute;mso-position-vertical-relative:text;mso-width-percent:0;mso-height-percent:0;mso-width-relative:margin;mso-height-relative:margin;v-text-anchor:top" o:gfxdata="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" stroked="f">
+              <v:shape w14:anchorId="68D54235" id="_x0000_s1029" type="#_x0000_t202" style="position:absolute;margin-left:8.95pt;margin-top:11.85pt;width:388.2pt;height:36pt;z-index:251661312;visibility:visible;mso-wrap-style:square;mso-width-percent:0;mso-height-percent:0;mso-wrap-distance-left:9pt;mso-wrap-distance-top:3.6pt;mso-wrap-distance-right:9pt;mso-wrap-distance-bottom:3.6pt;mso-position-horizontal:absolute;mso-position-horizontal-relative:text;mso-position-vertical:absolute;mso-position-vertical-relative:text;mso-width-percent:0;mso-height-percent:0;mso-width-relative:margin;mso-height-relative:margin;v-text-anchor:top" o:gfxdata="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" stroked="f">
                 <v:textbox>
                   <w:txbxContent>
                     <w:p>
@@ -1038,15 +1028,7 @@
                           <w:szCs w:val="20"/>
                           <w:lang w:val="en-US"/>
                         </w:rPr>
-                        <w:t xml:space="preserve"> </w:t>
-                      </w:r>
-                      <w:r>
-                        <w:rPr>
-                          <w:sz w:val="20"/>
-                          <w:szCs w:val="20"/>
-                          <w:lang w:val="en-US"/>
-                        </w:rPr>
-                        <w:t>Print legibly all information required in CAPITAL letters and ch</w:t>
+                        <w:t xml:space="preserve"> Print legibly all information required in CAPITAL letters and ch</w:t>
                       </w:r>
                       <w:r>
                         <w:rPr>
@@ -1148,7 +1130,8 @@
         <w:gridCol w:w="1799"/>
         <w:gridCol w:w="993"/>
         <w:gridCol w:w="1889"/>
-        <w:gridCol w:w="1710"/>
+        <w:gridCol w:w="286"/>
+        <w:gridCol w:w="1424"/>
         <w:gridCol w:w="1979"/>
         <w:gridCol w:w="1350"/>
       </w:tblGrid>
@@ -1156,7 +1139,7 @@
         <w:tc>
           <w:tcPr>
             <w:tcW w:w="9445" w:type="dxa"/>
-            <w:gridSpan w:val="6"/>
+            <w:gridSpan w:val="7"/>
             <w:shd w:val="pct15" w:color="auto" w:fill="7030A0"/>
             <w:vAlign w:val="center"/>
           </w:tcPr>
@@ -1225,7 +1208,7 @@
         <w:tc>
           <w:tcPr>
             <w:tcW w:w="5578" w:type="dxa"/>
-            <w:gridSpan w:val="3"/>
+            <w:gridSpan w:val="4"/>
             <w:vAlign w:val="center"/>
           </w:tcPr>
           <w:p>
@@ -1307,7 +1290,7 @@
         <w:tc>
           <w:tcPr>
             <w:tcW w:w="3689" w:type="dxa"/>
-            <w:gridSpan w:val="2"/>
+            <w:gridSpan w:val="3"/>
             <w:vAlign w:val="center"/>
           </w:tcPr>
           <w:p>
@@ -1395,7 +1378,7 @@
         <w:tc>
           <w:tcPr>
             <w:tcW w:w="3689" w:type="dxa"/>
-            <w:gridSpan w:val="2"/>
+            <w:gridSpan w:val="3"/>
             <w:vAlign w:val="center"/>
           </w:tcPr>
           <w:p>
@@ -1522,6 +1505,7 @@
         <w:tc>
           <w:tcPr>
             <w:tcW w:w="1710" w:type="dxa"/>
+            <w:gridSpan w:val="2"/>
             <w:vAlign w:val="center"/>
           </w:tcPr>
           <w:p>
@@ -1660,6 +1644,7 @@
         <w:tc>
           <w:tcPr>
             <w:tcW w:w="1710" w:type="dxa"/>
+            <w:gridSpan w:val="2"/>
             <w:vAlign w:val="center"/>
           </w:tcPr>
           <w:p>
@@ -1735,7 +1720,7 @@
         </w:tc>
         <w:tc>
           <w:tcPr>
-            <w:tcW w:w="4592" w:type="dxa"/>
+            <w:tcW w:w="3168" w:type="dxa"/>
             <w:gridSpan w:val="3"/>
             <w:vAlign w:val="center"/>
           </w:tcPr>
@@ -1749,63 +1734,34 @@
               <w:rPr>
                 <w:rFonts w:ascii="Tahoma" w:hAnsi="Tahoma" w:cs="Tahoma"/>
               </w:rPr>
-              <w:t>${IP_COMMUNITY}</w:t>
-            </w:r>
-            <w:r>
-              <w:rPr>
-                <w:rFonts w:ascii="Tahoma" w:hAnsi="Tahoma" w:cs="Tahoma"/>
-              </w:rPr>
-              <w:t xml:space="preserve"> </w:t>
-            </w:r>
-            <w:r>
-              <w:rPr>
-                <w:rFonts w:ascii="Segoe UI Symbol" w:hAnsi="Segoe UI Symbol" w:cs="Segoe UI Symbol"/>
-              </w:rPr>
-              <w:t>☑</w:t>
-            </w:r>
-            <w:r>
-              <w:rPr>
-                <w:rFonts w:ascii="Tahoma" w:hAnsi="Tahoma" w:cs="Tahoma"/>
-              </w:rPr>
-              <w:t xml:space="preserve"> Yes / </w:t>
-            </w:r>
-            <w:r>
-              <w:rPr>
-                <w:rFonts w:ascii="Segoe UI Symbol" w:hAnsi="Segoe UI Symbol" w:cs="Segoe UI Symbol"/>
-              </w:rPr>
-              <w:t>☐</w:t>
-            </w:r>
-            <w:r>
-              <w:rPr>
-                <w:rFonts w:ascii="Tahoma" w:hAnsi="Tahoma" w:cs="Tahoma"/>
-              </w:rPr>
-              <w:t xml:space="preserve"> No</w:t>
-            </w:r>
-          </w:p>
-        </w:tc>
-        <w:tc>
-          <w:tcPr>
-            <w:tcW w:w="1979" w:type="dxa"/>
-            <w:vAlign w:val="center"/>
-          </w:tcPr>
-          <w:p>
-            <w:pPr>
-              <w:rPr>
-                <w:rFonts w:ascii="Tahoma" w:hAnsi="Tahoma" w:cs="Tahoma"/>
-              </w:rPr>
-            </w:pPr>
-          </w:p>
-        </w:tc>
-        <w:tc>
-          <w:tcPr>
-            <w:tcW w:w="1350" w:type="dxa"/>
-          </w:tcPr>
-          <w:p>
-            <w:pPr>
-              <w:rPr>
-                <w:rFonts w:ascii="Tahoma" w:hAnsi="Tahoma" w:cs="Tahoma"/>
-              </w:rPr>
-            </w:pPr>
+              <w:t>${IP_COMMUNITY</w:t>
+            </w:r>
+            <w:r>
+              <w:rPr>
+                <w:rFonts w:ascii="Tahoma" w:hAnsi="Tahoma" w:cs="Tahoma"/>
+              </w:rPr>
+              <w:t>}</w:t>
+            </w:r>
+          </w:p>
+        </w:tc>
+        <w:tc>
+          <w:tcPr>
+            <w:tcW w:w="4753" w:type="dxa"/>
+            <w:gridSpan w:val="3"/>
+            <w:vAlign w:val="center"/>
+          </w:tcPr>
+          <w:p>
+            <w:pPr>
+              <w:rPr>
+                <w:rFonts w:ascii="Tahoma" w:hAnsi="Tahoma" w:cs="Tahoma"/>
+              </w:rPr>
+            </w:pPr>
+            <w:r>
+              <w:rPr>
+                <w:rFonts w:ascii="Tahoma" w:hAnsi="Tahoma" w:cs="Tahoma"/>
+              </w:rPr>
+              <w:t>${IP_SPECIFY}</w:t>
+            </w:r>
           </w:p>
         </w:tc>
       </w:tr>
@@ -1854,7 +1810,7 @@
         </w:tc>
         <w:tc>
           <w:tcPr>
-            <w:tcW w:w="4592" w:type="dxa"/>
+            <w:tcW w:w="3168" w:type="dxa"/>
             <w:gridSpan w:val="3"/>
             <w:vAlign w:val="center"/>
           </w:tcPr>
@@ -1874,27 +1830,22 @@
         </w:tc>
         <w:tc>
           <w:tcPr>
-            <w:tcW w:w="1979" w:type="dxa"/>
-            <w:vAlign w:val="center"/>
-          </w:tcPr>
-          <w:p>
-            <w:pPr>
-              <w:rPr>
-                <w:rFonts w:ascii="Tahoma" w:hAnsi="Tahoma" w:cs="Tahoma"/>
-              </w:rPr>
-            </w:pPr>
-          </w:p>
-        </w:tc>
-        <w:tc>
-          <w:tcPr>
-            <w:tcW w:w="1350" w:type="dxa"/>
-          </w:tcPr>
-          <w:p>
-            <w:pPr>
-              <w:rPr>
-                <w:rFonts w:ascii="Tahoma" w:hAnsi="Tahoma" w:cs="Tahoma"/>
-              </w:rPr>
-            </w:pPr>
+            <w:tcW w:w="4753" w:type="dxa"/>
+            <w:gridSpan w:val="3"/>
+            <w:vAlign w:val="center"/>
+          </w:tcPr>
+          <w:p>
+            <w:pPr>
+              <w:rPr>
+                <w:rFonts w:ascii="Tahoma" w:hAnsi="Tahoma" w:cs="Tahoma"/>
+              </w:rPr>
+            </w:pPr>
+            <w:r>
+              <w:rPr>
+                <w:rFonts w:ascii="Tahoma" w:hAnsi="Tahoma" w:cs="Tahoma"/>
+              </w:rPr>
+              <w:t>${FPS_ID}</w:t>
+            </w:r>
           </w:p>
         </w:tc>
       </w:tr>
@@ -3080,7 +3031,7 @@
         <mc:AlternateContent>
           <mc:Choice Requires="wps">
             <w:drawing>
-              <wp:anchor distT="0" distB="0" distL="114300" distR="114300" simplePos="0" relativeHeight="251684864" behindDoc="0" locked="0" layoutInCell="1" allowOverlap="1" wp14:anchorId="7085605D" wp14:editId="6CDF5395">
+              <wp:anchor distT="0" distB="0" distL="114300" distR="114300" simplePos="0" relativeHeight="251683840" behindDoc="0" locked="0" layoutInCell="1" allowOverlap="1" wp14:anchorId="7085605D" wp14:editId="71EA71AF">
                 <wp:simplePos x="0" y="0"/>
                 <wp:positionH relativeFrom="column">
                   <wp:posOffset>-438151</wp:posOffset>
@@ -3132,13 +3083,20 @@
           </mc:Choice>
           <mc:Fallback>
             <w:pict>
-              <v:line w14:anchorId="1F995AE1" id="Straight Connector 31" o:spid="_x0000_s1026" style="position:absolute;z-index:251684864;visibility:visible;mso-wrap-style:square;mso-wrap-distance-left:9pt;mso-wrap-distance-top:0;mso-wrap-distance-right:9pt;mso-wrap-distance-bottom:0;mso-position-horizontal:absolute;mso-position-horizontal-relative:text;mso-position-vertical:absolute;mso-position-vertical-relative:text" from="-34.5pt,86.05pt" to="576.75pt,86.05pt" o:gfxdata="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" strokecolor="black [3200]" strokeweight="1.5pt">
+              <v:line w14:anchorId="7BD89D2D" id="Straight Connector 31" o:spid="_x0000_s1026" style="position:absolute;z-index:251683840;visibility:visible;mso-wrap-style:square;mso-wrap-distance-left:9pt;mso-wrap-distance-top:0;mso-wrap-distance-right:9pt;mso-wrap-distance-bottom:0;mso-position-horizontal:absolute;mso-position-horizontal-relative:text;mso-position-vertical:absolute;mso-position-vertical-relative:text" from="-34.5pt,86.05pt" to="576.75pt,86.05pt" o:gfxdata="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" strokecolor="black [3200]" strokeweight="1.5pt">
                 <v:stroke dashstyle="dash" joinstyle="miter"/>
               </v:line>
             </w:pict>
           </mc:Fallback>
         </mc:AlternateContent>
       </w:r>
+    </w:p>
+    <w:p>
+      <w:pPr>
+        <w:rPr>
+          <w:rFonts w:ascii="Engravers MT" w:hAnsi="Engravers MT"/>
+        </w:rPr>
+      </w:pPr>
     </w:p>
     <w:p>
       <w:pPr>
@@ -3415,7 +3373,7 @@
                 <w:bottom w:val="single" w:sz="2" w:space="0" w:color="E5E7EB"/>
                 <w:right w:val="single" w:sz="2" w:space="0" w:color="E5E7EB"/>
               </w:pBdr>
-              <w:spacing w:before="100" w:beforeAutospacing="1" w:after="100" w:afterAutospacing="1" w:line="240" w:lineRule="auto"/>
+              <w:spacing w:before="100" w:beforeAutospacing="1" w:after="100" w:afterAutospacing="1"/>
               <w:outlineLvl w:val="2"/>
               <w:rPr>
                 <w:rFonts w:ascii="Tahoma" w:eastAsia="Times New Roman" w:hAnsi="Tahoma" w:cs="Tahoma"/>
@@ -6284,18 +6242,7 @@
                       <w:lang w:eastAsia="en-PH"/>
                       <w14:ligatures w14:val="none"/>
                     </w:rPr>
-                    <w:t>Guardian’s</w:t>
-                  </w:r>
-                  <w:r>
-                    <w:rPr>
-                      <w:rFonts w:ascii="Tahoma" w:eastAsia="Times New Roman" w:hAnsi="Tahoma" w:cs="Tahoma"/>
-                      <w:kern w:val="0"/>
-                      <w:sz w:val="18"/>
-                      <w:szCs w:val="18"/>
-                      <w:lang w:eastAsia="en-PH"/>
-                      <w14:ligatures w14:val="none"/>
-                    </w:rPr>
-                    <w:t xml:space="preserve"> Printed Name over Signature</w:t>
+                    <w:t>Guardian’s Printed Name over Signature</w:t>
                   </w:r>
                 </w:p>
               </w:tc>
@@ -6361,7 +6308,6 @@
           </w:tcPr>
           <w:p>
             <w:pPr>
-              <w:spacing w:after="0" w:line="240" w:lineRule="auto"/>
               <w:rPr>
                 <w:rFonts w:ascii="Tahoma" w:hAnsi="Tahoma" w:cs="Tahoma"/>
                 <w:sz w:val="18"/>
@@ -7378,7 +7324,6 @@
           </w:p>
           <w:p>
             <w:pPr>
-              <w:spacing w:after="0" w:line="240" w:lineRule="auto"/>
               <w:rPr>
                 <w:rFonts w:ascii="Tahoma" w:hAnsi="Tahoma" w:cs="Tahoma"/>
                 <w:sz w:val="18"/>
@@ -7424,18 +7369,7 @@
                       <w:lang w:eastAsia="en-PH"/>
                       <w14:ligatures w14:val="none"/>
                     </w:rPr>
-                    <w:t>Learner’s</w:t>
-                  </w:r>
-                  <w:r>
-                    <w:rPr>
-                      <w:rFonts w:ascii="Tahoma" w:eastAsia="Times New Roman" w:hAnsi="Tahoma" w:cs="Tahoma"/>
-                      <w:kern w:val="0"/>
-                      <w:sz w:val="18"/>
-                      <w:szCs w:val="18"/>
-                      <w:lang w:eastAsia="en-PH"/>
-                      <w14:ligatures w14:val="none"/>
-                    </w:rPr>
-                    <w:t xml:space="preserve"> Printed Name over Signature</w:t>
+                    <w:t>Learner’s Printed Name over Signature</w:t>
                   </w:r>
                 </w:p>
               </w:tc>
@@ -7717,13 +7651,6 @@
     </w:p>
     <w:p>
       <w:pPr>
-        <w:rPr>
-          <w:rFonts w:ascii="Engravers MT" w:hAnsi="Engravers MT"/>
-        </w:rPr>
-      </w:pPr>
-    </w:p>
-    <w:p>
-      <w:pPr>
         <w:tabs>
           <w:tab w:val="left" w:pos="2655"/>
         </w:tabs>
@@ -7744,620 +7671,6 @@
           <w:rFonts w:ascii="Engravers MT" w:hAnsi="Engravers MT"/>
         </w:rPr>
       </w:pPr>
-      <w:r>
-        <w:rPr>
-          <w:rFonts w:ascii="Engravers MT" w:hAnsi="Engravers MT"/>
-          <w:noProof/>
-        </w:rPr>
-        <mc:AlternateContent>
-          <mc:Choice Requires="wpg">
-            <w:drawing>
-              <wp:anchor distT="0" distB="0" distL="114300" distR="114300" simplePos="0" relativeHeight="251683840" behindDoc="0" locked="0" layoutInCell="1" allowOverlap="1" wp14:anchorId="125F6C7D" wp14:editId="002D8736">
-                <wp:simplePos x="0" y="0"/>
-                <wp:positionH relativeFrom="column">
-                  <wp:posOffset>4366895</wp:posOffset>
-                </wp:positionH>
-                <wp:positionV relativeFrom="paragraph">
-                  <wp:posOffset>239395</wp:posOffset>
-                </wp:positionV>
-                <wp:extent cx="1947545" cy="3090545"/>
-                <wp:effectExtent l="38100" t="38100" r="33655" b="33655"/>
-                <wp:wrapNone/>
-                <wp:docPr id="20" name="Group 20"/>
-                <wp:cNvGraphicFramePr/>
-                <a:graphic xmlns:a="http://schemas.openxmlformats.org/drawingml/2006/main">
-                  <a:graphicData uri="http://schemas.microsoft.com/office/word/2010/wordprocessingGroup">
-                    <wpg:wgp>
-                      <wpg:cNvGrpSpPr/>
-                      <wpg:grpSpPr>
-                        <a:xfrm rot="5400000">
-                          <a:off x="0" y="0"/>
-                          <a:ext cx="1947545" cy="3090545"/>
-                          <a:chOff x="0" y="0"/>
-                          <a:chExt cx="1947545" cy="3090545"/>
-                        </a:xfrm>
-                      </wpg:grpSpPr>
-                      <wps:wsp>
-                        <wps:cNvPr id="21" name="Text Box 2"/>
-                        <wps:cNvSpPr txBox="1">
-                          <a:spLocks noChangeArrowheads="1"/>
-                        </wps:cNvSpPr>
-                        <wps:spPr bwMode="auto">
-                          <a:xfrm>
-                            <a:off x="0" y="0"/>
-                            <a:ext cx="1947545" cy="3090545"/>
-                          </a:xfrm>
-                          <a:prstGeom prst="rect">
-                            <a:avLst/>
-                          </a:prstGeom>
-                          <a:solidFill>
-                            <a:srgbClr val="FFFFFF"/>
-                          </a:solidFill>
-                          <a:ln w="76200">
-                            <a:solidFill>
-                              <a:srgbClr val="000000"/>
-                            </a:solidFill>
-                            <a:miter lim="800000"/>
-                            <a:headEnd/>
-                            <a:tailEnd/>
-                          </a:ln>
-                        </wps:spPr>
-                        <wps:txbx>
-                          <w:txbxContent>
-                            <w:p>
-                              <w:pPr>
-                                <w:jc w:val="center"/>
-                                <w:rPr>
-                                  <w:lang w:val="en-US"/>
-                                </w:rPr>
-                              </w:pPr>
-                            </w:p>
-                          </w:txbxContent>
-                        </wps:txbx>
-                        <wps:bodyPr rot="0" vert="horz" wrap="square" lIns="91440" tIns="45720" rIns="91440" bIns="45720" anchor="ctr" anchorCtr="0">
-                          <a:noAutofit/>
-                        </wps:bodyPr>
-                      </wps:wsp>
-                      <wps:wsp>
-                        <wps:cNvPr id="22" name="Text Box 2"/>
-                        <wps:cNvSpPr txBox="1">
-                          <a:spLocks noChangeArrowheads="1"/>
-                        </wps:cNvSpPr>
-                        <wps:spPr bwMode="auto">
-                          <a:xfrm>
-                            <a:off x="506052" y="438734"/>
-                            <a:ext cx="914400" cy="914400"/>
-                          </a:xfrm>
-                          <a:prstGeom prst="rect">
-                            <a:avLst/>
-                          </a:prstGeom>
-                          <a:solidFill>
-                            <a:srgbClr val="FFFFFF"/>
-                          </a:solidFill>
-                          <a:ln w="12700">
-                            <a:solidFill>
-                              <a:srgbClr val="000000"/>
-                            </a:solidFill>
-                            <a:miter lim="800000"/>
-                            <a:headEnd/>
-                            <a:tailEnd/>
-                          </a:ln>
-                        </wps:spPr>
-                        <wps:txbx>
-                          <w:txbxContent>
-                            <w:p>
-                              <w:pPr>
-                                <w:jc w:val="center"/>
-                                <w:rPr>
-                                  <w:lang w:val="en-US"/>
-                                </w:rPr>
-                              </w:pPr>
-                              <w:r>
-                                <w:rPr>
-                                  <w:lang w:val="en-US"/>
-                                </w:rPr>
-                                <w:t>PHOTO ID</w:t>
-                              </w:r>
-                            </w:p>
-                          </w:txbxContent>
-                        </wps:txbx>
-                        <wps:bodyPr rot="0" vert="horz" wrap="square" lIns="91440" tIns="45720" rIns="91440" bIns="45720" anchor="ctr" anchorCtr="0">
-                          <a:noAutofit/>
-                        </wps:bodyPr>
-                      </wps:wsp>
-                      <wps:wsp>
-                        <wps:cNvPr id="23" name="Text Box 2"/>
-                        <wps:cNvSpPr txBox="1">
-                          <a:spLocks noChangeArrowheads="1"/>
-                        </wps:cNvSpPr>
-                        <wps:spPr bwMode="auto">
-                          <a:xfrm>
-                            <a:off x="377027" y="1684113"/>
-                            <a:ext cx="1193710" cy="1141820"/>
-                          </a:xfrm>
-                          <a:prstGeom prst="rect">
-                            <a:avLst/>
-                          </a:prstGeom>
-                          <a:solidFill>
-                            <a:srgbClr val="FFFFFF"/>
-                          </a:solidFill>
-                          <a:ln w="12700">
-                            <a:solidFill>
-                              <a:srgbClr val="000000"/>
-                            </a:solidFill>
-                            <a:miter lim="800000"/>
-                            <a:headEnd/>
-                            <a:tailEnd/>
-                          </a:ln>
-                        </wps:spPr>
-                        <wps:txbx>
-                          <w:txbxContent>
-                            <w:p>
-                              <w:pPr>
-                                <w:jc w:val="center"/>
-                                <w:rPr>
-                                  <w:lang w:val="en-US"/>
-                                </w:rPr>
-                              </w:pPr>
-                              <w:r>
-                                <w:rPr>
-                                  <w:lang w:val="en-US"/>
-                                </w:rPr>
-                                <w:t>QRCODE</w:t>
-                              </w:r>
-                            </w:p>
-                          </w:txbxContent>
-                        </wps:txbx>
-                        <wps:bodyPr rot="0" vert="horz" wrap="square" lIns="91440" tIns="45720" rIns="91440" bIns="45720" anchor="ctr" anchorCtr="0">
-                          <a:noAutofit/>
-                        </wps:bodyPr>
-                      </wps:wsp>
-                      <wpg:grpSp>
-                        <wpg:cNvPr id="24" name="Group 24"/>
-                        <wpg:cNvGrpSpPr/>
-                        <wpg:grpSpPr>
-                          <a:xfrm>
-                            <a:off x="259220" y="1308256"/>
-                            <a:ext cx="1371600" cy="465759"/>
-                            <a:chOff x="0" y="0"/>
-                            <a:chExt cx="1371600" cy="465759"/>
-                          </a:xfrm>
-                        </wpg:grpSpPr>
-                        <wps:wsp>
-                          <wps:cNvPr id="25" name="Text Box 2"/>
-                          <wps:cNvSpPr txBox="1">
-                            <a:spLocks noChangeArrowheads="1"/>
-                          </wps:cNvSpPr>
-                          <wps:spPr bwMode="auto">
-                            <a:xfrm>
-                              <a:off x="0" y="0"/>
-                              <a:ext cx="1371600" cy="332509"/>
-                            </a:xfrm>
-                            <a:prstGeom prst="rect">
-                              <a:avLst/>
-                            </a:prstGeom>
-                            <a:noFill/>
-                            <a:ln w="76200">
-                              <a:noFill/>
-                              <a:miter lim="800000"/>
-                              <a:headEnd/>
-                              <a:tailEnd/>
-                            </a:ln>
-                          </wps:spPr>
-                          <wps:txbx>
-                            <w:txbxContent>
-                              <w:p>
-                                <w:pPr>
-                                  <w:jc w:val="center"/>
-                                  <w:rPr>
-                                    <w:sz w:val="20"/>
-                                    <w:szCs w:val="20"/>
-                                    <w:lang w:val="en-US"/>
-                                  </w:rPr>
-                                </w:pPr>
-                                <w:r>
-                                  <w:rPr>
-                                    <w:sz w:val="20"/>
-                                    <w:szCs w:val="20"/>
-                                    <w:lang w:val="en-US"/>
-                                  </w:rPr>
-                                  <w:t>STUDENT’S NAME</w:t>
-                                </w:r>
-                              </w:p>
-                            </w:txbxContent>
-                          </wps:txbx>
-                          <wps:bodyPr rot="0" vert="horz" wrap="square" lIns="91440" tIns="45720" rIns="91440" bIns="45720" anchor="ctr" anchorCtr="0">
-                            <a:noAutofit/>
-                          </wps:bodyPr>
-                        </wps:wsp>
-                        <wps:wsp>
-                          <wps:cNvPr id="26" name="Text Box 2"/>
-                          <wps:cNvSpPr txBox="1">
-                            <a:spLocks noChangeArrowheads="1"/>
-                          </wps:cNvSpPr>
-                          <wps:spPr bwMode="auto">
-                            <a:xfrm>
-                              <a:off x="0" y="133250"/>
-                              <a:ext cx="1371600" cy="332509"/>
-                            </a:xfrm>
-                            <a:prstGeom prst="rect">
-                              <a:avLst/>
-                            </a:prstGeom>
-                            <a:noFill/>
-                            <a:ln w="76200">
-                              <a:noFill/>
-                              <a:miter lim="800000"/>
-                              <a:headEnd/>
-                              <a:tailEnd/>
-                            </a:ln>
-                          </wps:spPr>
-                          <wps:txbx>
-                            <w:txbxContent>
-                              <w:p>
-                                <w:pPr>
-                                  <w:jc w:val="center"/>
-                                  <w:rPr>
-                                    <w:sz w:val="18"/>
-                                    <w:szCs w:val="18"/>
-                                    <w:lang w:val="en-US"/>
-                                  </w:rPr>
-                                </w:pPr>
-                                <w:r>
-                                  <w:rPr>
-                                    <w:sz w:val="18"/>
-                                    <w:szCs w:val="18"/>
-                                    <w:lang w:val="en-US"/>
-                                  </w:rPr>
-                                  <w:t>LRN</w:t>
-                                </w:r>
-                              </w:p>
-                            </w:txbxContent>
-                          </wps:txbx>
-                          <wps:bodyPr rot="0" vert="horz" wrap="square" lIns="91440" tIns="45720" rIns="91440" bIns="45720" anchor="ctr" anchorCtr="0">
-                            <a:noAutofit/>
-                          </wps:bodyPr>
-                        </wps:wsp>
-                      </wpg:grpSp>
-                      <wps:wsp>
-                        <wps:cNvPr id="27" name="Text Box 2"/>
-                        <wps:cNvSpPr txBox="1">
-                          <a:spLocks noChangeArrowheads="1"/>
-                        </wps:cNvSpPr>
-                        <wps:spPr bwMode="auto">
-                          <a:xfrm>
-                            <a:off x="461174" y="34828"/>
-                            <a:ext cx="1351965" cy="437565"/>
-                          </a:xfrm>
-                          <a:prstGeom prst="rect">
-                            <a:avLst/>
-                          </a:prstGeom>
-                          <a:noFill/>
-                          <a:ln w="76200">
-                            <a:noFill/>
-                            <a:miter lim="800000"/>
-                            <a:headEnd/>
-                            <a:tailEnd/>
-                          </a:ln>
-                        </wps:spPr>
-                        <wps:txbx>
-                          <w:txbxContent>
-                            <w:p>
-                              <w:pPr>
-                                <w:pStyle w:val="NoSpacing"/>
-                                <w:rPr>
-                                  <w:sz w:val="16"/>
-                                  <w:szCs w:val="16"/>
-                                  <w:lang w:val="en-US"/>
-                                </w:rPr>
-                              </w:pPr>
-                              <w:r>
-                                <w:rPr>
-                                  <w:sz w:val="16"/>
-                                  <w:szCs w:val="16"/>
-                                  <w:lang w:val="en-US"/>
-                                </w:rPr>
-                                <w:t>DANIEL R. AGUINALDO NATIONAL HIGH SCHOOL</w:t>
-                              </w:r>
-                            </w:p>
-                            <w:p>
-                              <w:pPr>
-                                <w:pStyle w:val="NoSpacing"/>
-                                <w:rPr>
-                                  <w:sz w:val="14"/>
-                                  <w:szCs w:val="14"/>
-                                  <w:lang w:val="en-US"/>
-                                </w:rPr>
-                              </w:pPr>
-                            </w:p>
-                          </w:txbxContent>
-                        </wps:txbx>
-                        <wps:bodyPr rot="0" vert="horz" wrap="square" lIns="91440" tIns="45720" rIns="91440" bIns="45720" anchor="ctr" anchorCtr="0">
-                          <a:noAutofit/>
-                        </wps:bodyPr>
-                      </wps:wsp>
-                      <wps:wsp>
-                        <wps:cNvPr id="28" name="Text Box 2"/>
-                        <wps:cNvSpPr txBox="1">
-                          <a:spLocks noChangeArrowheads="1"/>
-                        </wps:cNvSpPr>
-                        <wps:spPr bwMode="auto">
-                          <a:xfrm>
-                            <a:off x="29218" y="2839735"/>
-                            <a:ext cx="1884812" cy="222760"/>
-                          </a:xfrm>
-                          <a:prstGeom prst="rect">
-                            <a:avLst/>
-                          </a:prstGeom>
-                          <a:solidFill>
-                            <a:srgbClr val="7030A0"/>
-                          </a:solidFill>
-                          <a:ln>
-                            <a:headEnd/>
-                            <a:tailEnd/>
-                          </a:ln>
-                        </wps:spPr>
-                        <wps:style>
-                          <a:lnRef idx="2">
-                            <a:schemeClr val="accent1">
-                              <a:shade val="15000"/>
-                            </a:schemeClr>
-                          </a:lnRef>
-                          <a:fillRef idx="1">
-                            <a:schemeClr val="accent1"/>
-                          </a:fillRef>
-                          <a:effectRef idx="0">
-                            <a:schemeClr val="accent1"/>
-                          </a:effectRef>
-                          <a:fontRef idx="minor">
-                            <a:schemeClr val="lt1"/>
-                          </a:fontRef>
-                        </wps:style>
-                        <wps:txbx>
-                          <w:txbxContent>
-                            <w:p>
-                              <w:pPr>
-                                <w:pStyle w:val="NoSpacing"/>
-                                <w:jc w:val="center"/>
-                                <w:rPr>
-                                  <w:rFonts w:ascii="Tahoma" w:hAnsi="Tahoma" w:cs="Tahoma"/>
-                                  <w:sz w:val="18"/>
-                                  <w:szCs w:val="18"/>
-                                  <w:lang w:val="en-US"/>
-                                </w:rPr>
-                              </w:pPr>
-                              <w:r>
-                                <w:rPr>
-                                  <w:rFonts w:ascii="Tahoma" w:hAnsi="Tahoma" w:cs="Tahoma"/>
-                                  <w:sz w:val="18"/>
-                                  <w:szCs w:val="18"/>
-                                  <w:lang w:val="en-US"/>
-                                </w:rPr>
-                                <w:t>TEMPORARY ID</w:t>
-                              </w:r>
-                            </w:p>
-                          </w:txbxContent>
-                        </wps:txbx>
-                        <wps:bodyPr rot="0" vert="horz" wrap="square" lIns="91440" tIns="45720" rIns="91440" bIns="45720" anchor="ctr" anchorCtr="0">
-                          <a:noAutofit/>
-                        </wps:bodyPr>
-                      </wps:wsp>
-                      <wps:wsp>
-                        <wps:cNvPr id="29" name="Oval 29"/>
-                        <wps:cNvSpPr/>
-                        <wps:spPr>
-                          <a:xfrm>
-                            <a:off x="163854" y="135804"/>
-                            <a:ext cx="213173" cy="213173"/>
-                          </a:xfrm>
-                          <a:prstGeom prst="ellipse">
-                            <a:avLst/>
-                          </a:prstGeom>
-                        </wps:spPr>
-                        <wps:style>
-                          <a:lnRef idx="2">
-                            <a:schemeClr val="accent6">
-                              <a:shade val="15000"/>
-                            </a:schemeClr>
-                          </a:lnRef>
-                          <a:fillRef idx="1">
-                            <a:schemeClr val="accent6"/>
-                          </a:fillRef>
-                          <a:effectRef idx="0">
-                            <a:schemeClr val="accent6"/>
-                          </a:effectRef>
-                          <a:fontRef idx="minor">
-                            <a:schemeClr val="lt1"/>
-                          </a:fontRef>
-                        </wps:style>
-                        <wps:bodyPr rot="0" spcFirstLastPara="0" vertOverflow="overflow" horzOverflow="overflow" vert="horz" wrap="square" lIns="91440" tIns="45720" rIns="91440" bIns="45720" numCol="1" spcCol="0" rtlCol="0" fromWordArt="0" anchor="ctr" anchorCtr="0" forceAA="0" compatLnSpc="1">
-                          <a:prstTxWarp prst="textNoShape">
-                            <a:avLst/>
-                          </a:prstTxWarp>
-                          <a:noAutofit/>
-                        </wps:bodyPr>
-                      </wps:wsp>
-                    </wpg:wgp>
-                  </a:graphicData>
-                </a:graphic>
-              </wp:anchor>
-            </w:drawing>
-          </mc:Choice>
-          <mc:Fallback>
-            <w:pict>
-              <v:group w14:anchorId="125F6C7D" id="Group 20" o:spid="_x0000_s1030" style="position:absolute;margin-left:343.85pt;margin-top:18.85pt;width:153.35pt;height:243.35pt;rotation:90;z-index:251683840" coordsize="19475,30905" o:gfxdata="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">
-                <v:shape id="_x0000_s1031" type="#_x0000_t202" style="position:absolute;width:19475;height:30905;visibility:visible;mso-wrap-style:square;v-text-anchor:middle" o:gfxdata="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" strokeweight="6pt">
-                  <v:textbox>
-                    <w:txbxContent>
-                      <w:p>
-                        <w:pPr>
-                          <w:jc w:val="center"/>
-                          <w:rPr>
-                            <w:lang w:val="en-US"/>
-                          </w:rPr>
-                        </w:pPr>
-                      </w:p>
-                    </w:txbxContent>
-                  </v:textbox>
-                </v:shape>
-                <v:shape id="_x0000_s1032" type="#_x0000_t202" style="position:absolute;left:5060;top:4387;width:9144;height:9144;visibility:visible;mso-wrap-style:square;v-text-anchor:middle" o:gfxdata="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" strokeweight="1pt">
-                  <v:textbox>
-                    <w:txbxContent>
-                      <w:p>
-                        <w:pPr>
-                          <w:jc w:val="center"/>
-                          <w:rPr>
-                            <w:lang w:val="en-US"/>
-                          </w:rPr>
-                        </w:pPr>
-                        <w:r>
-                          <w:rPr>
-                            <w:lang w:val="en-US"/>
-                          </w:rPr>
-                          <w:t>PHOTO ID</w:t>
-                        </w:r>
-                      </w:p>
-                    </w:txbxContent>
-                  </v:textbox>
-                </v:shape>
-                <v:shape id="_x0000_s1033" type="#_x0000_t202" style="position:absolute;left:3770;top:16841;width:11937;height:11418;visibility:visible;mso-wrap-style:square;v-text-anchor:middle" o:gfxdata="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" strokeweight="1pt">
-                  <v:textbox>
-                    <w:txbxContent>
-                      <w:p>
-                        <w:pPr>
-                          <w:jc w:val="center"/>
-                          <w:rPr>
-                            <w:lang w:val="en-US"/>
-                          </w:rPr>
-                        </w:pPr>
-                        <w:r>
-                          <w:rPr>
-                            <w:lang w:val="en-US"/>
-                          </w:rPr>
-                          <w:t>QRCODE</w:t>
-                        </w:r>
-                      </w:p>
-                    </w:txbxContent>
-                  </v:textbox>
-                </v:shape>
-                <v:group id="Group 24" o:spid="_x0000_s1034" style="position:absolute;left:2592;top:13082;width:13716;height:4658" coordsize="13716,4657" o:gfxdata="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">
-                  <v:shape id="_x0000_s1035" type="#_x0000_t202" style="position:absolute;width:13716;height:3325;visibility:visible;mso-wrap-style:square;v-text-anchor:middle" o:gfxdata="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" filled="f" stroked="f" strokeweight="6pt">
-                    <v:textbox>
-                      <w:txbxContent>
-                        <w:p>
-                          <w:pPr>
-                            <w:jc w:val="center"/>
-                            <w:rPr>
-                              <w:sz w:val="20"/>
-                              <w:szCs w:val="20"/>
-                              <w:lang w:val="en-US"/>
-                            </w:rPr>
-                          </w:pPr>
-                          <w:r>
-                            <w:rPr>
-                              <w:sz w:val="20"/>
-                              <w:szCs w:val="20"/>
-                              <w:lang w:val="en-US"/>
-                            </w:rPr>
-                            <w:t>STUDENT’S NAME</w:t>
-                          </w:r>
-                        </w:p>
-                      </w:txbxContent>
-                    </v:textbox>
-                  </v:shape>
-                  <v:shape id="_x0000_s1036" type="#_x0000_t202" style="position:absolute;top:1332;width:13716;height:3325;visibility:visible;mso-wrap-style:square;v-text-anchor:middle" o:gfxdata="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" filled="f" stroked="f" strokeweight="6pt">
-                    <v:textbox>
-                      <w:txbxContent>
-                        <w:p>
-                          <w:pPr>
-                            <w:jc w:val="center"/>
-                            <w:rPr>
-                              <w:sz w:val="18"/>
-                              <w:szCs w:val="18"/>
-                              <w:lang w:val="en-US"/>
-                            </w:rPr>
-                          </w:pPr>
-                          <w:r>
-                            <w:rPr>
-                              <w:sz w:val="18"/>
-                              <w:szCs w:val="18"/>
-                              <w:lang w:val="en-US"/>
-                            </w:rPr>
-                            <w:t>LRN</w:t>
-                          </w:r>
-                        </w:p>
-                      </w:txbxContent>
-                    </v:textbox>
-                  </v:shape>
-                </v:group>
-                <v:shape id="_x0000_s1037" type="#_x0000_t202" style="position:absolute;left:4611;top:348;width:13520;height:4375;visibility:visible;mso-wrap-style:square;v-text-anchor:middle" o:gfxdata="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" filled="f" stroked="f" strokeweight="6pt">
-                  <v:textbox>
-                    <w:txbxContent>
-                      <w:p>
-                        <w:pPr>
-                          <w:pStyle w:val="NoSpacing"/>
-                          <w:rPr>
-                            <w:sz w:val="16"/>
-                            <w:szCs w:val="16"/>
-                            <w:lang w:val="en-US"/>
-                          </w:rPr>
-                        </w:pPr>
-                        <w:r>
-                          <w:rPr>
-                            <w:sz w:val="16"/>
-                            <w:szCs w:val="16"/>
-                            <w:lang w:val="en-US"/>
-                          </w:rPr>
-                          <w:t>DANIEL R. AGUINALDO NATIONAL HIGH SCHOOL</w:t>
-                        </w:r>
-                      </w:p>
-                      <w:p>
-                        <w:pPr>
-                          <w:pStyle w:val="NoSpacing"/>
-                          <w:rPr>
-                            <w:sz w:val="14"/>
-                            <w:szCs w:val="14"/>
-                            <w:lang w:val="en-US"/>
-                          </w:rPr>
-                        </w:pPr>
-                      </w:p>
-                    </w:txbxContent>
-                  </v:textbox>
-                </v:shape>
-                <v:shape id="_x0000_s1038" type="#_x0000_t202" style="position:absolute;left:292;top:28397;width:18848;height:2227;visibility:visible;mso-wrap-style:square;v-text-anchor:middle" o:gfxdata="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" fillcolor="#7030a0" strokecolor="#09101d [484]" strokeweight="1pt">
-                  <v:textbox>
-                    <w:txbxContent>
-                      <w:p>
-                        <w:pPr>
-                          <w:pStyle w:val="NoSpacing"/>
-                          <w:jc w:val="center"/>
-                          <w:rPr>
-                            <w:rFonts w:ascii="Tahoma" w:hAnsi="Tahoma" w:cs="Tahoma"/>
-                            <w:sz w:val="18"/>
-                            <w:szCs w:val="18"/>
-                            <w:lang w:val="en-US"/>
-                          </w:rPr>
-                        </w:pPr>
-                        <w:r>
-                          <w:rPr>
-                            <w:rFonts w:ascii="Tahoma" w:hAnsi="Tahoma" w:cs="Tahoma"/>
-                            <w:sz w:val="18"/>
-                            <w:szCs w:val="18"/>
-                            <w:lang w:val="en-US"/>
-                          </w:rPr>
-                          <w:t>TEMPORARY ID</w:t>
-                        </w:r>
-                      </w:p>
-                    </w:txbxContent>
-                  </v:textbox>
-                </v:shape>
-                <v:oval id="Oval 29" o:spid="_x0000_s1039" style="position:absolute;left:1638;top:1358;width:2132;height:2131;visibility:visible;mso-wrap-style:square;v-text-anchor:middle" o:gfxdata="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" fillcolor="#70ad47 [3209]" strokecolor="#10190a [489]" strokeweight="1pt">
-                  <v:stroke joinstyle="miter"/>
-                </v:oval>
-              </v:group>
-            </w:pict>
-          </mc:Fallback>
-        </mc:AlternateContent>
-      </w:r>
     </w:p>
     <w:p>
       <w:pPr>
@@ -8365,620 +7678,6 @@
           <w:rFonts w:ascii="Engravers MT" w:hAnsi="Engravers MT"/>
         </w:rPr>
       </w:pPr>
-      <w:r>
-        <w:rPr>
-          <w:rFonts w:ascii="Engravers MT" w:hAnsi="Engravers MT"/>
-          <w:noProof/>
-        </w:rPr>
-        <mc:AlternateContent>
-          <mc:Choice Requires="wpg">
-            <w:drawing>
-              <wp:anchor distT="0" distB="0" distL="114300" distR="114300" simplePos="0" relativeHeight="251681792" behindDoc="0" locked="0" layoutInCell="1" allowOverlap="1" wp14:anchorId="5414C4BA" wp14:editId="6B8CA958">
-                <wp:simplePos x="0" y="0"/>
-                <wp:positionH relativeFrom="column">
-                  <wp:posOffset>570047</wp:posOffset>
-                </wp:positionH>
-                <wp:positionV relativeFrom="paragraph">
-                  <wp:posOffset>206262</wp:posOffset>
-                </wp:positionV>
-                <wp:extent cx="1947545" cy="3090545"/>
-                <wp:effectExtent l="38100" t="38100" r="33655" b="33655"/>
-                <wp:wrapNone/>
-                <wp:docPr id="19" name="Group 19"/>
-                <wp:cNvGraphicFramePr/>
-                <a:graphic xmlns:a="http://schemas.openxmlformats.org/drawingml/2006/main">
-                  <a:graphicData uri="http://schemas.microsoft.com/office/word/2010/wordprocessingGroup">
-                    <wpg:wgp>
-                      <wpg:cNvGrpSpPr/>
-                      <wpg:grpSpPr>
-                        <a:xfrm rot="5400000">
-                          <a:off x="0" y="0"/>
-                          <a:ext cx="1947545" cy="3090545"/>
-                          <a:chOff x="0" y="0"/>
-                          <a:chExt cx="1947545" cy="3090545"/>
-                        </a:xfrm>
-                      </wpg:grpSpPr>
-                      <wps:wsp>
-                        <wps:cNvPr id="8" name="Text Box 2"/>
-                        <wps:cNvSpPr txBox="1">
-                          <a:spLocks noChangeArrowheads="1"/>
-                        </wps:cNvSpPr>
-                        <wps:spPr bwMode="auto">
-                          <a:xfrm>
-                            <a:off x="0" y="0"/>
-                            <a:ext cx="1947545" cy="3090545"/>
-                          </a:xfrm>
-                          <a:prstGeom prst="rect">
-                            <a:avLst/>
-                          </a:prstGeom>
-                          <a:solidFill>
-                            <a:srgbClr val="FFFFFF"/>
-                          </a:solidFill>
-                          <a:ln w="76200">
-                            <a:solidFill>
-                              <a:srgbClr val="000000"/>
-                            </a:solidFill>
-                            <a:miter lim="800000"/>
-                            <a:headEnd/>
-                            <a:tailEnd/>
-                          </a:ln>
-                        </wps:spPr>
-                        <wps:txbx>
-                          <w:txbxContent>
-                            <w:p>
-                              <w:pPr>
-                                <w:jc w:val="center"/>
-                                <w:rPr>
-                                  <w:lang w:val="en-US"/>
-                                </w:rPr>
-                              </w:pPr>
-                            </w:p>
-                          </w:txbxContent>
-                        </wps:txbx>
-                        <wps:bodyPr rot="0" vert="horz" wrap="square" lIns="91440" tIns="45720" rIns="91440" bIns="45720" anchor="ctr" anchorCtr="0">
-                          <a:noAutofit/>
-                        </wps:bodyPr>
-                      </wps:wsp>
-                      <wps:wsp>
-                        <wps:cNvPr id="7" name="Text Box 2"/>
-                        <wps:cNvSpPr txBox="1">
-                          <a:spLocks noChangeArrowheads="1"/>
-                        </wps:cNvSpPr>
-                        <wps:spPr bwMode="auto">
-                          <a:xfrm>
-                            <a:off x="506052" y="438734"/>
-                            <a:ext cx="914400" cy="914400"/>
-                          </a:xfrm>
-                          <a:prstGeom prst="rect">
-                            <a:avLst/>
-                          </a:prstGeom>
-                          <a:solidFill>
-                            <a:srgbClr val="FFFFFF"/>
-                          </a:solidFill>
-                          <a:ln w="12700">
-                            <a:solidFill>
-                              <a:srgbClr val="000000"/>
-                            </a:solidFill>
-                            <a:miter lim="800000"/>
-                            <a:headEnd/>
-                            <a:tailEnd/>
-                          </a:ln>
-                        </wps:spPr>
-                        <wps:txbx>
-                          <w:txbxContent>
-                            <w:p>
-                              <w:pPr>
-                                <w:jc w:val="center"/>
-                                <w:rPr>
-                                  <w:lang w:val="en-US"/>
-                                </w:rPr>
-                              </w:pPr>
-                              <w:r>
-                                <w:rPr>
-                                  <w:lang w:val="en-US"/>
-                                </w:rPr>
-                                <w:t>${ID_PHOTO}</w:t>
-                              </w:r>
-                            </w:p>
-                          </w:txbxContent>
-                        </wps:txbx>
-                        <wps:bodyPr rot="0" vert="horz" wrap="square" lIns="91440" tIns="45720" rIns="91440" bIns="45720" anchor="ctr" anchorCtr="0">
-                          <a:noAutofit/>
-                        </wps:bodyPr>
-                      </wps:wsp>
-                      <wps:wsp>
-                        <wps:cNvPr id="9" name="Text Box 2"/>
-                        <wps:cNvSpPr txBox="1">
-                          <a:spLocks noChangeArrowheads="1"/>
-                        </wps:cNvSpPr>
-                        <wps:spPr bwMode="auto">
-                          <a:xfrm>
-                            <a:off x="377027" y="1684113"/>
-                            <a:ext cx="1193710" cy="1141820"/>
-                          </a:xfrm>
-                          <a:prstGeom prst="rect">
-                            <a:avLst/>
-                          </a:prstGeom>
-                          <a:solidFill>
-                            <a:srgbClr val="FFFFFF"/>
-                          </a:solidFill>
-                          <a:ln w="12700">
-                            <a:solidFill>
-                              <a:srgbClr val="000000"/>
-                            </a:solidFill>
-                            <a:miter lim="800000"/>
-                            <a:headEnd/>
-                            <a:tailEnd/>
-                          </a:ln>
-                        </wps:spPr>
-                        <wps:txbx>
-                          <w:txbxContent>
-                            <w:p>
-                              <w:pPr>
-                                <w:jc w:val="center"/>
-                                <w:rPr>
-                                  <w:lang w:val="en-US"/>
-                                </w:rPr>
-                              </w:pPr>
-                              <w:r>
-                                <w:rPr>
-                                  <w:lang w:val="en-US"/>
-                                </w:rPr>
-                                <w:t>${QR_CODE}</w:t>
-                              </w:r>
-                            </w:p>
-                          </w:txbxContent>
-                        </wps:txbx>
-                        <wps:bodyPr rot="0" vert="horz" wrap="square" lIns="91440" tIns="45720" rIns="91440" bIns="45720" anchor="ctr" anchorCtr="0">
-                          <a:noAutofit/>
-                        </wps:bodyPr>
-                      </wps:wsp>
-                      <wpg:grpSp>
-                        <wpg:cNvPr id="14" name="Group 14"/>
-                        <wpg:cNvGrpSpPr/>
-                        <wpg:grpSpPr>
-                          <a:xfrm>
-                            <a:off x="259220" y="1308256"/>
-                            <a:ext cx="1371600" cy="465759"/>
-                            <a:chOff x="0" y="0"/>
-                            <a:chExt cx="1371600" cy="465759"/>
-                          </a:xfrm>
-                        </wpg:grpSpPr>
-                        <wps:wsp>
-                          <wps:cNvPr id="12" name="Text Box 2"/>
-                          <wps:cNvSpPr txBox="1">
-                            <a:spLocks noChangeArrowheads="1"/>
-                          </wps:cNvSpPr>
-                          <wps:spPr bwMode="auto">
-                            <a:xfrm>
-                              <a:off x="0" y="0"/>
-                              <a:ext cx="1371600" cy="332509"/>
-                            </a:xfrm>
-                            <a:prstGeom prst="rect">
-                              <a:avLst/>
-                            </a:prstGeom>
-                            <a:noFill/>
-                            <a:ln w="76200">
-                              <a:noFill/>
-                              <a:miter lim="800000"/>
-                              <a:headEnd/>
-                              <a:tailEnd/>
-                            </a:ln>
-                          </wps:spPr>
-                          <wps:txbx>
-                            <w:txbxContent>
-                              <w:p>
-                                <w:pPr>
-                                  <w:jc w:val="center"/>
-                                  <w:rPr>
-                                    <w:sz w:val="20"/>
-                                    <w:szCs w:val="20"/>
-                                    <w:lang w:val="en-US"/>
-                                  </w:rPr>
-                                </w:pPr>
-                                <w:r>
-                                  <w:rPr>
-                                    <w:sz w:val="20"/>
-                                    <w:szCs w:val="20"/>
-                                    <w:lang w:val="en-US"/>
-                                  </w:rPr>
-                                  <w:t>${FULL_NAME}</w:t>
-                                </w:r>
-                              </w:p>
-                            </w:txbxContent>
-                          </wps:txbx>
-                          <wps:bodyPr rot="0" vert="horz" wrap="square" lIns="91440" tIns="45720" rIns="91440" bIns="45720" anchor="ctr" anchorCtr="0">
-                            <a:noAutofit/>
-                          </wps:bodyPr>
-                        </wps:wsp>
-                        <wps:wsp>
-                          <wps:cNvPr id="13" name="Text Box 2"/>
-                          <wps:cNvSpPr txBox="1">
-                            <a:spLocks noChangeArrowheads="1"/>
-                          </wps:cNvSpPr>
-                          <wps:spPr bwMode="auto">
-                            <a:xfrm>
-                              <a:off x="0" y="133250"/>
-                              <a:ext cx="1371600" cy="332509"/>
-                            </a:xfrm>
-                            <a:prstGeom prst="rect">
-                              <a:avLst/>
-                            </a:prstGeom>
-                            <a:noFill/>
-                            <a:ln w="76200">
-                              <a:noFill/>
-                              <a:miter lim="800000"/>
-                              <a:headEnd/>
-                              <a:tailEnd/>
-                            </a:ln>
-                          </wps:spPr>
-                          <wps:txbx>
-                            <w:txbxContent>
-                              <w:p>
-                                <w:pPr>
-                                  <w:jc w:val="center"/>
-                                  <w:rPr>
-                                    <w:sz w:val="18"/>
-                                    <w:szCs w:val="18"/>
-                                    <w:lang w:val="en-US"/>
-                                  </w:rPr>
-                                </w:pPr>
-                                <w:r>
-                                  <w:rPr>
-                                    <w:sz w:val="18"/>
-                                    <w:szCs w:val="18"/>
-                                    <w:lang w:val="en-US"/>
-                                  </w:rPr>
-                                  <w:t>${LRN}</w:t>
-                                </w:r>
-                              </w:p>
-                            </w:txbxContent>
-                          </wps:txbx>
-                          <wps:bodyPr rot="0" vert="horz" wrap="square" lIns="91440" tIns="45720" rIns="91440" bIns="45720" anchor="ctr" anchorCtr="0">
-                            <a:noAutofit/>
-                          </wps:bodyPr>
-                        </wps:wsp>
-                      </wpg:grpSp>
-                      <wps:wsp>
-                        <wps:cNvPr id="16" name="Text Box 2"/>
-                        <wps:cNvSpPr txBox="1">
-                          <a:spLocks noChangeArrowheads="1"/>
-                        </wps:cNvSpPr>
-                        <wps:spPr bwMode="auto">
-                          <a:xfrm>
-                            <a:off x="461174" y="34828"/>
-                            <a:ext cx="1351965" cy="437565"/>
-                          </a:xfrm>
-                          <a:prstGeom prst="rect">
-                            <a:avLst/>
-                          </a:prstGeom>
-                          <a:noFill/>
-                          <a:ln w="76200">
-                            <a:noFill/>
-                            <a:miter lim="800000"/>
-                            <a:headEnd/>
-                            <a:tailEnd/>
-                          </a:ln>
-                        </wps:spPr>
-                        <wps:txbx>
-                          <w:txbxContent>
-                            <w:p>
-                              <w:pPr>
-                                <w:pStyle w:val="NoSpacing"/>
-                                <w:rPr>
-                                  <w:sz w:val="16"/>
-                                  <w:szCs w:val="16"/>
-                                  <w:lang w:val="en-US"/>
-                                </w:rPr>
-                              </w:pPr>
-                              <w:r>
-                                <w:rPr>
-                                  <w:sz w:val="16"/>
-                                  <w:szCs w:val="16"/>
-                                  <w:lang w:val="en-US"/>
-                                </w:rPr>
-                                <w:t>DANIEL R. AGUINALDO NATIONAL HIGH SCHOOL</w:t>
-                              </w:r>
-                            </w:p>
-                            <w:p>
-                              <w:pPr>
-                                <w:pStyle w:val="NoSpacing"/>
-                                <w:rPr>
-                                  <w:sz w:val="14"/>
-                                  <w:szCs w:val="14"/>
-                                  <w:lang w:val="en-US"/>
-                                </w:rPr>
-                              </w:pPr>
-                            </w:p>
-                          </w:txbxContent>
-                        </wps:txbx>
-                        <wps:bodyPr rot="0" vert="horz" wrap="square" lIns="91440" tIns="45720" rIns="91440" bIns="45720" anchor="ctr" anchorCtr="0">
-                          <a:noAutofit/>
-                        </wps:bodyPr>
-                      </wps:wsp>
-                      <wps:wsp>
-                        <wps:cNvPr id="17" name="Text Box 2"/>
-                        <wps:cNvSpPr txBox="1">
-                          <a:spLocks noChangeArrowheads="1"/>
-                        </wps:cNvSpPr>
-                        <wps:spPr bwMode="auto">
-                          <a:xfrm>
-                            <a:off x="29218" y="2839735"/>
-                            <a:ext cx="1884812" cy="222760"/>
-                          </a:xfrm>
-                          <a:prstGeom prst="rect">
-                            <a:avLst/>
-                          </a:prstGeom>
-                          <a:solidFill>
-                            <a:srgbClr val="7030A0"/>
-                          </a:solidFill>
-                          <a:ln>
-                            <a:headEnd/>
-                            <a:tailEnd/>
-                          </a:ln>
-                        </wps:spPr>
-                        <wps:style>
-                          <a:lnRef idx="2">
-                            <a:schemeClr val="accent1">
-                              <a:shade val="15000"/>
-                            </a:schemeClr>
-                          </a:lnRef>
-                          <a:fillRef idx="1">
-                            <a:schemeClr val="accent1"/>
-                          </a:fillRef>
-                          <a:effectRef idx="0">
-                            <a:schemeClr val="accent1"/>
-                          </a:effectRef>
-                          <a:fontRef idx="minor">
-                            <a:schemeClr val="lt1"/>
-                          </a:fontRef>
-                        </wps:style>
-                        <wps:txbx>
-                          <w:txbxContent>
-                            <w:p>
-                              <w:pPr>
-                                <w:pStyle w:val="NoSpacing"/>
-                                <w:jc w:val="center"/>
-                                <w:rPr>
-                                  <w:rFonts w:ascii="Tahoma" w:hAnsi="Tahoma" w:cs="Tahoma"/>
-                                  <w:sz w:val="18"/>
-                                  <w:szCs w:val="18"/>
-                                  <w:lang w:val="en-US"/>
-                                </w:rPr>
-                              </w:pPr>
-                              <w:r>
-                                <w:rPr>
-                                  <w:rFonts w:ascii="Tahoma" w:hAnsi="Tahoma" w:cs="Tahoma"/>
-                                  <w:sz w:val="18"/>
-                                  <w:szCs w:val="18"/>
-                                  <w:lang w:val="en-US"/>
-                                </w:rPr>
-                                <w:t>TEMPORARY ID</w:t>
-                              </w:r>
-                            </w:p>
-                          </w:txbxContent>
-                        </wps:txbx>
-                        <wps:bodyPr rot="0" vert="horz" wrap="square" lIns="91440" tIns="45720" rIns="91440" bIns="45720" anchor="ctr" anchorCtr="0">
-                          <a:noAutofit/>
-                        </wps:bodyPr>
-                      </wps:wsp>
-                      <wps:wsp>
-                        <wps:cNvPr id="18" name="Oval 18"/>
-                        <wps:cNvSpPr/>
-                        <wps:spPr>
-                          <a:xfrm>
-                            <a:off x="163854" y="135804"/>
-                            <a:ext cx="213173" cy="213173"/>
-                          </a:xfrm>
-                          <a:prstGeom prst="ellipse">
-                            <a:avLst/>
-                          </a:prstGeom>
-                        </wps:spPr>
-                        <wps:style>
-                          <a:lnRef idx="2">
-                            <a:schemeClr val="accent6">
-                              <a:shade val="15000"/>
-                            </a:schemeClr>
-                          </a:lnRef>
-                          <a:fillRef idx="1">
-                            <a:schemeClr val="accent6"/>
-                          </a:fillRef>
-                          <a:effectRef idx="0">
-                            <a:schemeClr val="accent6"/>
-                          </a:effectRef>
-                          <a:fontRef idx="minor">
-                            <a:schemeClr val="lt1"/>
-                          </a:fontRef>
-                        </wps:style>
-                        <wps:bodyPr rot="0" spcFirstLastPara="0" vertOverflow="overflow" horzOverflow="overflow" vert="horz" wrap="square" lIns="91440" tIns="45720" rIns="91440" bIns="45720" numCol="1" spcCol="0" rtlCol="0" fromWordArt="0" anchor="ctr" anchorCtr="0" forceAA="0" compatLnSpc="1">
-                          <a:prstTxWarp prst="textNoShape">
-                            <a:avLst/>
-                          </a:prstTxWarp>
-                          <a:noAutofit/>
-                        </wps:bodyPr>
-                      </wps:wsp>
-                    </wpg:wgp>
-                  </a:graphicData>
-                </a:graphic>
-              </wp:anchor>
-            </w:drawing>
-          </mc:Choice>
-          <mc:Fallback>
-            <w:pict>
-              <v:group w14:anchorId="5414C4BA" id="Group 19" o:spid="_x0000_s1040" style="position:absolute;margin-left:44.9pt;margin-top:16.25pt;width:153.35pt;height:243.35pt;rotation:90;z-index:251681792" coordsize="19475,30905" o:gfxdata="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">
-                <v:shape id="_x0000_s1041" type="#_x0000_t202" style="position:absolute;width:19475;height:30905;visibility:visible;mso-wrap-style:square;v-text-anchor:middle" o:gfxdata="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" strokeweight="6pt">
-                  <v:textbox>
-                    <w:txbxContent>
-                      <w:p>
-                        <w:pPr>
-                          <w:jc w:val="center"/>
-                          <w:rPr>
-                            <w:lang w:val="en-US"/>
-                          </w:rPr>
-                        </w:pPr>
-                      </w:p>
-                    </w:txbxContent>
-                  </v:textbox>
-                </v:shape>
-                <v:shape id="_x0000_s1042" type="#_x0000_t202" style="position:absolute;left:5060;top:4387;width:9144;height:9144;visibility:visible;mso-wrap-style:square;v-text-anchor:middle" o:gfxdata="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" strokeweight="1pt">
-                  <v:textbox>
-                    <w:txbxContent>
-                      <w:p>
-                        <w:pPr>
-                          <w:jc w:val="center"/>
-                          <w:rPr>
-                            <w:lang w:val="en-US"/>
-                          </w:rPr>
-                        </w:pPr>
-                        <w:r>
-                          <w:rPr>
-                            <w:lang w:val="en-US"/>
-                          </w:rPr>
-                          <w:t>${ID_PHOTO}</w:t>
-                        </w:r>
-                      </w:p>
-                    </w:txbxContent>
-                  </v:textbox>
-                </v:shape>
-                <v:shape id="_x0000_s1043" type="#_x0000_t202" style="position:absolute;left:3770;top:16841;width:11937;height:11418;visibility:visible;mso-wrap-style:square;v-text-anchor:middle" o:gfxdata="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" strokeweight="1pt">
-                  <v:textbox>
-                    <w:txbxContent>
-                      <w:p>
-                        <w:pPr>
-                          <w:jc w:val="center"/>
-                          <w:rPr>
-                            <w:lang w:val="en-US"/>
-                          </w:rPr>
-                        </w:pPr>
-                        <w:r>
-                          <w:rPr>
-                            <w:lang w:val="en-US"/>
-                          </w:rPr>
-                          <w:t>${QR_CODE}</w:t>
-                        </w:r>
-                      </w:p>
-                    </w:txbxContent>
-                  </v:textbox>
-                </v:shape>
-                <v:group id="Group 14" o:spid="_x0000_s1044" style="position:absolute;left:2592;top:13082;width:13716;height:4658" coordsize="13716,4657" o:gfxdata="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">
-                  <v:shape id="_x0000_s1045" type="#_x0000_t202" style="position:absolute;width:13716;height:3325;visibility:visible;mso-wrap-style:square;v-text-anchor:middle" o:gfxdata="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" filled="f" stroked="f" strokeweight="6pt">
-                    <v:textbox>
-                      <w:txbxContent>
-                        <w:p>
-                          <w:pPr>
-                            <w:jc w:val="center"/>
-                            <w:rPr>
-                              <w:sz w:val="20"/>
-                              <w:szCs w:val="20"/>
-                              <w:lang w:val="en-US"/>
-                            </w:rPr>
-                          </w:pPr>
-                          <w:r>
-                            <w:rPr>
-                              <w:sz w:val="20"/>
-                              <w:szCs w:val="20"/>
-                              <w:lang w:val="en-US"/>
-                            </w:rPr>
-                            <w:t>${FULL_NAME}</w:t>
-                          </w:r>
-                        </w:p>
-                      </w:txbxContent>
-                    </v:textbox>
-                  </v:shape>
-                  <v:shape id="_x0000_s1046" type="#_x0000_t202" style="position:absolute;top:1332;width:13716;height:3325;visibility:visible;mso-wrap-style:square;v-text-anchor:middle" o:gfxdata="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" filled="f" stroked="f" strokeweight="6pt">
-                    <v:textbox>
-                      <w:txbxContent>
-                        <w:p>
-                          <w:pPr>
-                            <w:jc w:val="center"/>
-                            <w:rPr>
-                              <w:sz w:val="18"/>
-                              <w:szCs w:val="18"/>
-                              <w:lang w:val="en-US"/>
-                            </w:rPr>
-                          </w:pPr>
-                          <w:r>
-                            <w:rPr>
-                              <w:sz w:val="18"/>
-                              <w:szCs w:val="18"/>
-                              <w:lang w:val="en-US"/>
-                            </w:rPr>
-                            <w:t>${LRN}</w:t>
-                          </w:r>
-                        </w:p>
-                      </w:txbxContent>
-                    </v:textbox>
-                  </v:shape>
-                </v:group>
-                <v:shape id="_x0000_s1047" type="#_x0000_t202" style="position:absolute;left:4611;top:348;width:13520;height:4375;visibility:visible;mso-wrap-style:square;v-text-anchor:middle" o:gfxdata="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" filled="f" stroked="f" strokeweight="6pt">
-                  <v:textbox>
-                    <w:txbxContent>
-                      <w:p>
-                        <w:pPr>
-                          <w:pStyle w:val="NoSpacing"/>
-                          <w:rPr>
-                            <w:sz w:val="16"/>
-                            <w:szCs w:val="16"/>
-                            <w:lang w:val="en-US"/>
-                          </w:rPr>
-                        </w:pPr>
-                        <w:r>
-                          <w:rPr>
-                            <w:sz w:val="16"/>
-                            <w:szCs w:val="16"/>
-                            <w:lang w:val="en-US"/>
-                          </w:rPr>
-                          <w:t>DANIEL R. AGUINALDO NATIONAL HIGH SCHOOL</w:t>
-                        </w:r>
-                      </w:p>
-                      <w:p>
-                        <w:pPr>
-                          <w:pStyle w:val="NoSpacing"/>
-                          <w:rPr>
-                            <w:sz w:val="14"/>
-                            <w:szCs w:val="14"/>
-                            <w:lang w:val="en-US"/>
-                          </w:rPr>
-                        </w:pPr>
-                      </w:p>
-                    </w:txbxContent>
-                  </v:textbox>
-                </v:shape>
-                <v:shape id="_x0000_s1048" type="#_x0000_t202" style="position:absolute;left:292;top:28397;width:18848;height:2227;visibility:visible;mso-wrap-style:square;v-text-anchor:middle" o:gfxdata="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" fillcolor="#7030a0" strokecolor="#09101d [484]" strokeweight="1pt">
-                  <v:textbox>
-                    <w:txbxContent>
-                      <w:p>
-                        <w:pPr>
-                          <w:pStyle w:val="NoSpacing"/>
-                          <w:jc w:val="center"/>
-                          <w:rPr>
-                            <w:rFonts w:ascii="Tahoma" w:hAnsi="Tahoma" w:cs="Tahoma"/>
-                            <w:sz w:val="18"/>
-                            <w:szCs w:val="18"/>
-                            <w:lang w:val="en-US"/>
-                          </w:rPr>
-                        </w:pPr>
-                        <w:r>
-                          <w:rPr>
-                            <w:rFonts w:ascii="Tahoma" w:hAnsi="Tahoma" w:cs="Tahoma"/>
-                            <w:sz w:val="18"/>
-                            <w:szCs w:val="18"/>
-                            <w:lang w:val="en-US"/>
-                          </w:rPr>
-                          <w:t>TEMPORARY ID</w:t>
-                        </w:r>
-                      </w:p>
-                    </w:txbxContent>
-                  </v:textbox>
-                </v:shape>
-                <v:oval id="Oval 18" o:spid="_x0000_s1049" style="position:absolute;left:1638;top:1358;width:2132;height:2131;visibility:visible;mso-wrap-style:square;v-text-anchor:middle" o:gfxdata="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" fillcolor="#70ad47 [3209]" strokecolor="#10190a [489]" strokeweight="1pt">
-                  <v:stroke joinstyle="miter"/>
-                </v:oval>
-              </v:group>
-            </w:pict>
-          </mc:Fallback>
-        </mc:AlternateContent>
-      </w:r>
     </w:p>
     <w:p>
       <w:pPr>
@@ -9001,13 +7700,13 @@
         <mc:AlternateContent>
           <mc:Choice Requires="wps">
             <w:drawing>
-              <wp:anchor distT="0" distB="0" distL="114300" distR="114300" simplePos="0" relativeHeight="251686912" behindDoc="0" locked="0" layoutInCell="1" allowOverlap="1" wp14:anchorId="001BD064" wp14:editId="47498BCC">
+              <wp:anchor distT="0" distB="0" distL="114300" distR="114300" simplePos="0" relativeHeight="251685888" behindDoc="0" locked="0" layoutInCell="1" allowOverlap="1" wp14:anchorId="001BD064" wp14:editId="7D8DF4F6">
                 <wp:simplePos x="0" y="0"/>
                 <wp:positionH relativeFrom="column">
                   <wp:posOffset>-333375</wp:posOffset>
                 </wp:positionH>
                 <wp:positionV relativeFrom="paragraph">
-                  <wp:posOffset>104140</wp:posOffset>
+                  <wp:posOffset>335280</wp:posOffset>
                 </wp:positionV>
                 <wp:extent cx="7762875" cy="0"/>
                 <wp:effectExtent l="0" t="0" r="0" b="0"/>
@@ -9053,9 +7752,658 @@
           </mc:Choice>
           <mc:Fallback>
             <w:pict>
-              <v:line w14:anchorId="388A59D2" id="Straight Connector 32" o:spid="_x0000_s1026" style="position:absolute;z-index:251686912;visibility:visible;mso-wrap-style:square;mso-wrap-distance-left:9pt;mso-wrap-distance-top:0;mso-wrap-distance-right:9pt;mso-wrap-distance-bottom:0;mso-position-horizontal:absolute;mso-position-horizontal-relative:text;mso-position-vertical:absolute;mso-position-vertical-relative:text" from="-26.25pt,8.2pt" to="585pt,8.2pt" o:gfxdata="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" strokecolor="black [3200]" strokeweight="1.5pt">
+              <v:line w14:anchorId="32EA7108" id="Straight Connector 32" o:spid="_x0000_s1026" style="position:absolute;z-index:251685888;visibility:visible;mso-wrap-style:square;mso-wrap-distance-left:9pt;mso-wrap-distance-top:0;mso-wrap-distance-right:9pt;mso-wrap-distance-bottom:0;mso-position-horizontal:absolute;mso-position-horizontal-relative:text;mso-position-vertical:absolute;mso-position-vertical-relative:text" from="-26.25pt,26.4pt" to="585pt,26.4pt" o:gfxdata="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" strokecolor="black [3200]" strokeweight="1.5pt">
                 <v:stroke dashstyle="dash" joinstyle="miter"/>
               </v:line>
+            </w:pict>
+          </mc:Fallback>
+        </mc:AlternateContent>
+      </w:r>
+    </w:p>
+    <w:p>
+      <w:pPr>
+        <w:rPr>
+          <w:rFonts w:ascii="Engravers MT" w:hAnsi="Engravers MT"/>
+        </w:rPr>
+      </w:pPr>
+      <w:r>
+        <w:rPr>
+          <w:rFonts w:ascii="Engravers MT" w:hAnsi="Engravers MT"/>
+          <w:noProof/>
+        </w:rPr>
+        <mc:AlternateContent>
+          <mc:Choice Requires="wpg">
+            <w:drawing>
+              <wp:anchor distT="0" distB="0" distL="114300" distR="114300" simplePos="0" relativeHeight="251687936" behindDoc="0" locked="0" layoutInCell="1" allowOverlap="1" wp14:anchorId="58691E7D" wp14:editId="77EBFF6E">
+                <wp:simplePos x="0" y="0"/>
+                <wp:positionH relativeFrom="column">
+                  <wp:posOffset>1244817</wp:posOffset>
+                </wp:positionH>
+                <wp:positionV relativeFrom="paragraph">
+                  <wp:posOffset>212090</wp:posOffset>
+                </wp:positionV>
+                <wp:extent cx="3090545" cy="1947545"/>
+                <wp:effectExtent l="38100" t="38100" r="33655" b="33655"/>
+                <wp:wrapNone/>
+                <wp:docPr id="6" name="Group 6"/>
+                <wp:cNvGraphicFramePr/>
+                <a:graphic xmlns:a="http://schemas.openxmlformats.org/drawingml/2006/main">
+                  <a:graphicData uri="http://schemas.microsoft.com/office/word/2010/wordprocessingGroup">
+                    <wpg:wgp>
+                      <wpg:cNvGrpSpPr/>
+                      <wpg:grpSpPr>
+                        <a:xfrm>
+                          <a:off x="0" y="0"/>
+                          <a:ext cx="3090545" cy="1947545"/>
+                          <a:chOff x="0" y="0"/>
+                          <a:chExt cx="3090545" cy="1947545"/>
+                        </a:xfrm>
+                      </wpg:grpSpPr>
+                      <wpg:grpSp>
+                        <wpg:cNvPr id="19" name="Group 19"/>
+                        <wpg:cNvGrpSpPr/>
+                        <wpg:grpSpPr>
+                          <a:xfrm rot="5400000">
+                            <a:off x="571500" y="-571500"/>
+                            <a:ext cx="1947545" cy="3090545"/>
+                            <a:chOff x="12357" y="-10635"/>
+                            <a:chExt cx="1947544" cy="3090545"/>
+                          </a:xfrm>
+                        </wpg:grpSpPr>
+                        <wps:wsp>
+                          <wps:cNvPr id="8" name="Text Box 2"/>
+                          <wps:cNvSpPr txBox="1">
+                            <a:spLocks noChangeArrowheads="1"/>
+                          </wps:cNvSpPr>
+                          <wps:spPr bwMode="auto">
+                            <a:xfrm>
+                              <a:off x="12357" y="-10635"/>
+                              <a:ext cx="1947544" cy="3090545"/>
+                            </a:xfrm>
+                            <a:prstGeom prst="rect">
+                              <a:avLst/>
+                            </a:prstGeom>
+                            <a:solidFill>
+                              <a:srgbClr val="FFFFFF"/>
+                            </a:solidFill>
+                            <a:ln w="76200">
+                              <a:solidFill>
+                                <a:srgbClr val="000000"/>
+                              </a:solidFill>
+                              <a:miter lim="800000"/>
+                              <a:headEnd/>
+                              <a:tailEnd/>
+                            </a:ln>
+                          </wps:spPr>
+                          <wps:txbx>
+                            <w:txbxContent>
+                              <w:p>
+                                <w:pPr>
+                                  <w:jc w:val="center"/>
+                                  <w:rPr>
+                                    <w:lang w:val="en-US"/>
+                                  </w:rPr>
+                                </w:pPr>
+                              </w:p>
+                            </w:txbxContent>
+                          </wps:txbx>
+                          <wps:bodyPr rot="0" vert="horz" wrap="square" lIns="91440" tIns="45720" rIns="91440" bIns="45720" anchor="ctr" anchorCtr="0">
+                            <a:noAutofit/>
+                          </wps:bodyPr>
+                        </wps:wsp>
+                        <wps:wsp>
+                          <wps:cNvPr id="7" name="Text Box 2"/>
+                          <wps:cNvSpPr txBox="1">
+                            <a:spLocks noChangeArrowheads="1"/>
+                          </wps:cNvSpPr>
+                          <wps:spPr bwMode="auto">
+                            <a:xfrm>
+                              <a:off x="506052" y="438734"/>
+                              <a:ext cx="914400" cy="914400"/>
+                            </a:xfrm>
+                            <a:prstGeom prst="rect">
+                              <a:avLst/>
+                            </a:prstGeom>
+                            <a:solidFill>
+                              <a:srgbClr val="FFFFFF"/>
+                            </a:solidFill>
+                            <a:ln w="12700">
+                              <a:noFill/>
+                              <a:miter lim="800000"/>
+                              <a:headEnd/>
+                              <a:tailEnd/>
+                            </a:ln>
+                          </wps:spPr>
+                          <wps:txbx>
+                            <w:txbxContent>
+                              <w:p>
+                                <w:pPr>
+                                  <w:jc w:val="center"/>
+                                  <w:rPr>
+                                    <w:lang w:val="en-US"/>
+                                  </w:rPr>
+                                </w:pPr>
+                                <w:r>
+                                  <w:rPr>
+                                    <w:lang w:val="en-US"/>
+                                  </w:rPr>
+                                  <w:t>${ID_PHOTO}</w:t>
+                                </w:r>
+                              </w:p>
+                            </w:txbxContent>
+                          </wps:txbx>
+                          <wps:bodyPr rot="0" vert="horz" wrap="square" lIns="91440" tIns="45720" rIns="91440" bIns="45720" anchor="ctr" anchorCtr="0">
+                            <a:noAutofit/>
+                          </wps:bodyPr>
+                        </wps:wsp>
+                        <wps:wsp>
+                          <wps:cNvPr id="9" name="Text Box 2"/>
+                          <wps:cNvSpPr txBox="1">
+                            <a:spLocks noChangeArrowheads="1"/>
+                          </wps:cNvSpPr>
+                          <wps:spPr bwMode="auto">
+                            <a:xfrm>
+                              <a:off x="461174" y="1672536"/>
+                              <a:ext cx="1097279" cy="1097280"/>
+                            </a:xfrm>
+                            <a:prstGeom prst="rect">
+                              <a:avLst/>
+                            </a:prstGeom>
+                            <a:solidFill>
+                              <a:srgbClr val="FFFFFF"/>
+                            </a:solidFill>
+                            <a:ln w="12700">
+                              <a:noFill/>
+                              <a:miter lim="800000"/>
+                              <a:headEnd/>
+                              <a:tailEnd/>
+                            </a:ln>
+                          </wps:spPr>
+                          <wps:txbx>
+                            <w:txbxContent>
+                              <w:p>
+                                <w:pPr>
+                                  <w:jc w:val="center"/>
+                                  <w:rPr>
+                                    <w:lang w:val="en-US"/>
+                                  </w:rPr>
+                                </w:pPr>
+                                <w:r>
+                                  <w:rPr>
+                                    <w:lang w:val="en-US"/>
+                                  </w:rPr>
+                                  <w:t>${QR_CODE}</w:t>
+                                </w:r>
+                              </w:p>
+                            </w:txbxContent>
+                          </wps:txbx>
+                          <wps:bodyPr rot="0" vert="horz" wrap="square" lIns="91440" tIns="45720" rIns="91440" bIns="45720" anchor="ctr" anchorCtr="0">
+                            <a:noAutofit/>
+                          </wps:bodyPr>
+                        </wps:wsp>
+                        <wpg:grpSp>
+                          <wpg:cNvPr id="14" name="Group 14"/>
+                          <wpg:cNvGrpSpPr/>
+                          <wpg:grpSpPr>
+                            <a:xfrm>
+                              <a:off x="259220" y="1308256"/>
+                              <a:ext cx="1371600" cy="465759"/>
+                              <a:chOff x="0" y="0"/>
+                              <a:chExt cx="1371600" cy="465759"/>
+                            </a:xfrm>
+                          </wpg:grpSpPr>
+                          <wps:wsp>
+                            <wps:cNvPr id="12" name="Text Box 2"/>
+                            <wps:cNvSpPr txBox="1">
+                              <a:spLocks noChangeArrowheads="1"/>
+                            </wps:cNvSpPr>
+                            <wps:spPr bwMode="auto">
+                              <a:xfrm>
+                                <a:off x="0" y="0"/>
+                                <a:ext cx="1371600" cy="332509"/>
+                              </a:xfrm>
+                              <a:prstGeom prst="rect">
+                                <a:avLst/>
+                              </a:prstGeom>
+                              <a:noFill/>
+                              <a:ln w="76200">
+                                <a:noFill/>
+                                <a:miter lim="800000"/>
+                                <a:headEnd/>
+                                <a:tailEnd/>
+                              </a:ln>
+                            </wps:spPr>
+                            <wps:txbx>
+                              <w:txbxContent>
+                                <w:p>
+                                  <w:pPr>
+                                    <w:jc w:val="center"/>
+                                    <w:rPr>
+                                      <w:sz w:val="20"/>
+                                      <w:szCs w:val="20"/>
+                                      <w:lang w:val="en-US"/>
+                                    </w:rPr>
+                                  </w:pPr>
+                                  <w:r>
+                                    <w:rPr>
+                                      <w:sz w:val="20"/>
+                                      <w:szCs w:val="20"/>
+                                      <w:lang w:val="en-US"/>
+                                    </w:rPr>
+                                    <w:t>${FULL_NAME}</w:t>
+                                  </w:r>
+                                </w:p>
+                              </w:txbxContent>
+                            </wps:txbx>
+                            <wps:bodyPr rot="0" vert="horz" wrap="square" lIns="91440" tIns="45720" rIns="91440" bIns="45720" anchor="ctr" anchorCtr="0">
+                              <a:noAutofit/>
+                            </wps:bodyPr>
+                          </wps:wsp>
+                          <wps:wsp>
+                            <wps:cNvPr id="13" name="Text Box 2"/>
+                            <wps:cNvSpPr txBox="1">
+                              <a:spLocks noChangeArrowheads="1"/>
+                            </wps:cNvSpPr>
+                            <wps:spPr bwMode="auto">
+                              <a:xfrm>
+                                <a:off x="0" y="133250"/>
+                                <a:ext cx="1371600" cy="332509"/>
+                              </a:xfrm>
+                              <a:prstGeom prst="rect">
+                                <a:avLst/>
+                              </a:prstGeom>
+                              <a:noFill/>
+                              <a:ln w="76200">
+                                <a:noFill/>
+                                <a:miter lim="800000"/>
+                                <a:headEnd/>
+                                <a:tailEnd/>
+                              </a:ln>
+                            </wps:spPr>
+                            <wps:txbx>
+                              <w:txbxContent>
+                                <w:p>
+                                  <w:pPr>
+                                    <w:jc w:val="center"/>
+                                    <w:rPr>
+                                      <w:sz w:val="18"/>
+                                      <w:szCs w:val="18"/>
+                                      <w:lang w:val="en-US"/>
+                                    </w:rPr>
+                                  </w:pPr>
+                                  <w:r>
+                                    <w:rPr>
+                                      <w:sz w:val="18"/>
+                                      <w:szCs w:val="18"/>
+                                      <w:lang w:val="en-US"/>
+                                    </w:rPr>
+                                    <w:t>${LRN}</w:t>
+                                  </w:r>
+                                </w:p>
+                              </w:txbxContent>
+                            </wps:txbx>
+                            <wps:bodyPr rot="0" vert="horz" wrap="square" lIns="91440" tIns="45720" rIns="91440" bIns="45720" anchor="ctr" anchorCtr="0">
+                              <a:noAutofit/>
+                            </wps:bodyPr>
+                          </wps:wsp>
+                        </wpg:grpSp>
+                        <wps:wsp>
+                          <wps:cNvPr id="16" name="Text Box 2"/>
+                          <wps:cNvSpPr txBox="1">
+                            <a:spLocks noChangeArrowheads="1"/>
+                          </wps:cNvSpPr>
+                          <wps:spPr bwMode="auto">
+                            <a:xfrm>
+                              <a:off x="461174" y="34828"/>
+                              <a:ext cx="1351965" cy="437565"/>
+                            </a:xfrm>
+                            <a:prstGeom prst="rect">
+                              <a:avLst/>
+                            </a:prstGeom>
+                            <a:noFill/>
+                            <a:ln w="76200">
+                              <a:noFill/>
+                              <a:miter lim="800000"/>
+                              <a:headEnd/>
+                              <a:tailEnd/>
+                            </a:ln>
+                          </wps:spPr>
+                          <wps:txbx>
+                            <w:txbxContent>
+                              <w:p>
+                                <w:pPr>
+                                  <w:pStyle w:val="NoSpacing"/>
+                                  <w:rPr>
+                                    <w:sz w:val="16"/>
+                                    <w:szCs w:val="16"/>
+                                    <w:lang w:val="en-US"/>
+                                  </w:rPr>
+                                </w:pPr>
+                                <w:r>
+                                  <w:rPr>
+                                    <w:sz w:val="16"/>
+                                    <w:szCs w:val="16"/>
+                                    <w:lang w:val="en-US"/>
+                                  </w:rPr>
+                                  <w:t>DANIEL R. AGUINALDO NATIONAL HIGH SCHOOL</w:t>
+                                </w:r>
+                              </w:p>
+                              <w:p>
+                                <w:pPr>
+                                  <w:pStyle w:val="NoSpacing"/>
+                                  <w:rPr>
+                                    <w:sz w:val="14"/>
+                                    <w:szCs w:val="14"/>
+                                    <w:lang w:val="en-US"/>
+                                  </w:rPr>
+                                </w:pPr>
+                              </w:p>
+                            </w:txbxContent>
+                          </wps:txbx>
+                          <wps:bodyPr rot="0" vert="horz" wrap="square" lIns="91440" tIns="45720" rIns="91440" bIns="45720" anchor="ctr" anchorCtr="0">
+                            <a:noAutofit/>
+                          </wps:bodyPr>
+                        </wps:wsp>
+                        <wps:wsp>
+                          <wps:cNvPr id="17" name="Text Box 2"/>
+                          <wps:cNvSpPr txBox="1">
+                            <a:spLocks noChangeArrowheads="1"/>
+                          </wps:cNvSpPr>
+                          <wps:spPr bwMode="auto">
+                            <a:xfrm>
+                              <a:off x="46576" y="2839735"/>
+                              <a:ext cx="1884812" cy="222760"/>
+                            </a:xfrm>
+                            <a:prstGeom prst="rect">
+                              <a:avLst/>
+                            </a:prstGeom>
+                            <a:solidFill>
+                              <a:srgbClr val="7030A0"/>
+                            </a:solidFill>
+                            <a:ln>
+                              <a:headEnd/>
+                              <a:tailEnd/>
+                            </a:ln>
+                          </wps:spPr>
+                          <wps:style>
+                            <a:lnRef idx="2">
+                              <a:schemeClr val="accent1">
+                                <a:shade val="15000"/>
+                              </a:schemeClr>
+                            </a:lnRef>
+                            <a:fillRef idx="1">
+                              <a:schemeClr val="accent1"/>
+                            </a:fillRef>
+                            <a:effectRef idx="0">
+                              <a:schemeClr val="accent1"/>
+                            </a:effectRef>
+                            <a:fontRef idx="minor">
+                              <a:schemeClr val="lt1"/>
+                            </a:fontRef>
+                          </wps:style>
+                          <wps:txbx>
+                            <w:txbxContent>
+                              <w:p>
+                                <w:pPr>
+                                  <w:pStyle w:val="NoSpacing"/>
+                                  <w:jc w:val="center"/>
+                                  <w:rPr>
+                                    <w:rFonts w:ascii="Tahoma" w:hAnsi="Tahoma" w:cs="Tahoma"/>
+                                    <w:sz w:val="18"/>
+                                    <w:szCs w:val="18"/>
+                                    <w:lang w:val="en-US"/>
+                                  </w:rPr>
+                                </w:pPr>
+                                <w:r>
+                                  <w:rPr>
+                                    <w:rFonts w:ascii="Tahoma" w:hAnsi="Tahoma" w:cs="Tahoma"/>
+                                    <w:sz w:val="18"/>
+                                    <w:szCs w:val="18"/>
+                                    <w:lang w:val="en-US"/>
+                                  </w:rPr>
+                                  <w:t>TEMPORARY ID</w:t>
+                                </w:r>
+                              </w:p>
+                            </w:txbxContent>
+                          </wps:txbx>
+                          <wps:bodyPr rot="0" vert="horz" wrap="square" lIns="91440" tIns="45720" rIns="91440" bIns="45720" anchor="ctr" anchorCtr="0">
+                            <a:noAutofit/>
+                          </wps:bodyPr>
+                        </wps:wsp>
+                      </wpg:grpSp>
+                      <pic:pic xmlns:pic="http://schemas.openxmlformats.org/drawingml/2006/picture">
+                        <pic:nvPicPr>
+                          <pic:cNvPr id="1" name="Picture 1"/>
+                          <pic:cNvPicPr>
+                            <a:picLocks noChangeAspect="1"/>
+                          </pic:cNvPicPr>
+                        </pic:nvPicPr>
+                        <pic:blipFill>
+                          <a:blip r:embed="rId9" cstate="print">
+                            <a:extLst>
+                              <a:ext uri="{28A0092B-C50C-407E-A947-70E740481C1C}">
+                                <a14:useLocalDpi xmlns:a14="http://schemas.microsoft.com/office/drawing/2010/main" val="0"/>
+                              </a:ext>
+                            </a:extLst>
+                          </a:blip>
+                          <a:srcRect/>
+                          <a:stretch>
+                            <a:fillRect/>
+                          </a:stretch>
+                        </pic:blipFill>
+                        <pic:spPr bwMode="auto">
+                          <a:xfrm rot="5400000">
+                            <a:off x="2689185" y="145648"/>
+                            <a:ext cx="300355" cy="300355"/>
+                          </a:xfrm>
+                          <a:prstGeom prst="rect">
+                            <a:avLst/>
+                          </a:prstGeom>
+                          <a:noFill/>
+                          <a:ln>
+                            <a:noFill/>
+                          </a:ln>
+                        </pic:spPr>
+                      </pic:pic>
+                    </wpg:wgp>
+                  </a:graphicData>
+                </a:graphic>
+              </wp:anchor>
+            </w:drawing>
+          </mc:Choice>
+          <mc:Fallback>
+            <w:pict>
+              <v:group w14:anchorId="58691E7D" id="Group 6" o:spid="_x0000_s1030" style="position:absolute;margin-left:98pt;margin-top:16.7pt;width:243.35pt;height:153.35pt;z-index:251687936" coordsize="30905,19475" o:gfxdata="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">
+                <v:group id="Group 19" o:spid="_x0000_s1031" style="position:absolute;left:5715;top:-5715;width:19475;height:30905;rotation:90" coordorigin="123,-106" coordsize="19475,30905" o:gfxdata="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">
+                  <v:shape id="_x0000_s1032" type="#_x0000_t202" style="position:absolute;left:123;top:-106;width:19476;height:30905;visibility:visible;mso-wrap-style:square;v-text-anchor:middle" o:gfxdata="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" strokeweight="6pt">
+                    <v:textbox>
+                      <w:txbxContent>
+                        <w:p>
+                          <w:pPr>
+                            <w:jc w:val="center"/>
+                            <w:rPr>
+                              <w:lang w:val="en-US"/>
+                            </w:rPr>
+                          </w:pPr>
+                        </w:p>
+                      </w:txbxContent>
+                    </v:textbox>
+                  </v:shape>
+                  <v:shape id="_x0000_s1033" type="#_x0000_t202" style="position:absolute;left:5060;top:4387;width:9144;height:9144;visibility:visible;mso-wrap-style:square;v-text-anchor:middle" o:gfxdata="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" stroked="f" strokeweight="1pt">
+                    <v:textbox>
+                      <w:txbxContent>
+                        <w:p>
+                          <w:pPr>
+                            <w:jc w:val="center"/>
+                            <w:rPr>
+                              <w:lang w:val="en-US"/>
+                            </w:rPr>
+                          </w:pPr>
+                          <w:r>
+                            <w:rPr>
+                              <w:lang w:val="en-US"/>
+                            </w:rPr>
+                            <w:t>${ID_PHOTO}</w:t>
+                          </w:r>
+                        </w:p>
+                      </w:txbxContent>
+                    </v:textbox>
+                  </v:shape>
+                  <v:shape id="_x0000_s1034" type="#_x0000_t202" style="position:absolute;left:4611;top:16725;width:10973;height:10973;visibility:visible;mso-wrap-style:square;v-text-anchor:middle" o:gfxdata="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" stroked="f" strokeweight="1pt">
+                    <v:textbox>
+                      <w:txbxContent>
+                        <w:p>
+                          <w:pPr>
+                            <w:jc w:val="center"/>
+                            <w:rPr>
+                              <w:lang w:val="en-US"/>
+                            </w:rPr>
+                          </w:pPr>
+                          <w:r>
+                            <w:rPr>
+                              <w:lang w:val="en-US"/>
+                            </w:rPr>
+                            <w:t>${QR_CODE}</w:t>
+                          </w:r>
+                        </w:p>
+                      </w:txbxContent>
+                    </v:textbox>
+                  </v:shape>
+                  <v:group id="Group 14" o:spid="_x0000_s1035" style="position:absolute;left:2592;top:13082;width:13716;height:4658" coordsize="13716,4657" o:gfxdata="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">
+                    <v:shape id="_x0000_s1036" type="#_x0000_t202" style="position:absolute;width:13716;height:3325;visibility:visible;mso-wrap-style:square;v-text-anchor:middle" o:gfxdata="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" filled="f" stroked="f" strokeweight="6pt">
+                      <v:textbox>
+                        <w:txbxContent>
+                          <w:p>
+                            <w:pPr>
+                              <w:jc w:val="center"/>
+                              <w:rPr>
+                                <w:sz w:val="20"/>
+                                <w:szCs w:val="20"/>
+                                <w:lang w:val="en-US"/>
+                              </w:rPr>
+                            </w:pPr>
+                            <w:r>
+                              <w:rPr>
+                                <w:sz w:val="20"/>
+                                <w:szCs w:val="20"/>
+                                <w:lang w:val="en-US"/>
+                              </w:rPr>
+                              <w:t>${FULL_NAME}</w:t>
+                            </w:r>
+                          </w:p>
+                        </w:txbxContent>
+                      </v:textbox>
+                    </v:shape>
+                    <v:shape id="_x0000_s1037" type="#_x0000_t202" style="position:absolute;top:1332;width:13716;height:3325;visibility:visible;mso-wrap-style:square;v-text-anchor:middle" o:gfxdata="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" filled="f" stroked="f" strokeweight="6pt">
+                      <v:textbox>
+                        <w:txbxContent>
+                          <w:p>
+                            <w:pPr>
+                              <w:jc w:val="center"/>
+                              <w:rPr>
+                                <w:sz w:val="18"/>
+                                <w:szCs w:val="18"/>
+                                <w:lang w:val="en-US"/>
+                              </w:rPr>
+                            </w:pPr>
+                            <w:r>
+                              <w:rPr>
+                                <w:sz w:val="18"/>
+                                <w:szCs w:val="18"/>
+                                <w:lang w:val="en-US"/>
+                              </w:rPr>
+                              <w:t>${LRN}</w:t>
+                            </w:r>
+                          </w:p>
+                        </w:txbxContent>
+                      </v:textbox>
+                    </v:shape>
+                  </v:group>
+                  <v:shape id="_x0000_s1038" type="#_x0000_t202" style="position:absolute;left:4611;top:348;width:13520;height:4375;visibility:visible;mso-wrap-style:square;v-text-anchor:middle" o:gfxdata="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" filled="f" stroked="f" strokeweight="6pt">
+                    <v:textbox>
+                      <w:txbxContent>
+                        <w:p>
+                          <w:pPr>
+                            <w:pStyle w:val="NoSpacing"/>
+                            <w:rPr>
+                              <w:sz w:val="16"/>
+                              <w:szCs w:val="16"/>
+                              <w:lang w:val="en-US"/>
+                            </w:rPr>
+                          </w:pPr>
+                          <w:r>
+                            <w:rPr>
+                              <w:sz w:val="16"/>
+                              <w:szCs w:val="16"/>
+                              <w:lang w:val="en-US"/>
+                            </w:rPr>
+                            <w:t>DANIEL R. AGUINALDO NATIONAL HIGH SCHOOL</w:t>
+                          </w:r>
+                        </w:p>
+                        <w:p>
+                          <w:pPr>
+                            <w:pStyle w:val="NoSpacing"/>
+                            <w:rPr>
+                              <w:sz w:val="14"/>
+                              <w:szCs w:val="14"/>
+                              <w:lang w:val="en-US"/>
+                            </w:rPr>
+                          </w:pPr>
+                        </w:p>
+                      </w:txbxContent>
+                    </v:textbox>
+                  </v:shape>
+                  <v:shape id="_x0000_s1039" type="#_x0000_t202" style="position:absolute;left:465;top:28397;width:18848;height:2227;visibility:visible;mso-wrap-style:square;v-text-anchor:middle" o:gfxdata="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" fillcolor="#7030a0" strokecolor="#09101d [484]" strokeweight="1pt">
+                    <v:textbox>
+                      <w:txbxContent>
+                        <w:p>
+                          <w:pPr>
+                            <w:pStyle w:val="NoSpacing"/>
+                            <w:jc w:val="center"/>
+                            <w:rPr>
+                              <w:rFonts w:ascii="Tahoma" w:hAnsi="Tahoma" w:cs="Tahoma"/>
+                              <w:sz w:val="18"/>
+                              <w:szCs w:val="18"/>
+                              <w:lang w:val="en-US"/>
+                            </w:rPr>
+                          </w:pPr>
+                          <w:r>
+                            <w:rPr>
+                              <w:rFonts w:ascii="Tahoma" w:hAnsi="Tahoma" w:cs="Tahoma"/>
+                              <w:sz w:val="18"/>
+                              <w:szCs w:val="18"/>
+                              <w:lang w:val="en-US"/>
+                            </w:rPr>
+                            <w:t>TEMPORARY ID</w:t>
+                          </w:r>
+                        </w:p>
+                      </w:txbxContent>
+                    </v:textbox>
+                  </v:shape>
+                </v:group>
+                <v:shapetype id="_x0000_t75" coordsize="21600,21600" o:spt="75" o:preferrelative="t" path="m@4@5l@4@11@9@11@9@5xe" filled="f" stroked="f">
+                  <v:stroke joinstyle="miter"/>
+                  <v:formulas>
+                    <v:f eqn="if lineDrawn pixelLineWidth 0"/>
+                    <v:f eqn="sum @0 1 0"/>
+                    <v:f eqn="sum 0 0 @1"/>
+                    <v:f eqn="prod @2 1 2"/>
+                    <v:f eqn="prod @3 21600 pixelWidth"/>
+                    <v:f eqn="prod @3 21600 pixelHeight"/>
+                    <v:f eqn="sum @0 0 1"/>
+                    <v:f eqn="prod @6 1 2"/>
+                    <v:f eqn="prod @7 21600 pixelWidth"/>
+                    <v:f eqn="sum @8 21600 0"/>
+                    <v:f eqn="prod @7 21600 pixelHeight"/>
+                    <v:f eqn="sum @10 21600 0"/>
+                  </v:formulas>
+                  <v:path o:extrusionok="f" gradientshapeok="t" o:connecttype="rect"/>
+                  <o:lock v:ext="edit" aspectratio="t"/>
+                </v:shapetype>
+                <v:shape id="Picture 1" o:spid="_x0000_s1040" type="#_x0000_t75" style="position:absolute;left:26891;top:1456;width:3004;height:3004;rotation:90;visibility:visible;mso-wrap-style:square" o:gfxdata="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">
+                  <v:imagedata r:id="rId10" o:title=""/>
+                </v:shape>
+              </v:group>
             </w:pict>
           </mc:Fallback>
         </mc:AlternateContent>
@@ -9084,29 +8432,24 @@
     </w:p>
     <w:p>
       <w:pPr>
+        <w:tabs>
+          <w:tab w:val="left" w:pos="5994"/>
+        </w:tabs>
         <w:rPr>
           <w:rFonts w:ascii="Engravers MT" w:hAnsi="Engravers MT"/>
         </w:rPr>
       </w:pPr>
-    </w:p>
-    <w:p>
-      <w:pPr>
+      <w:r>
         <w:rPr>
           <w:rFonts w:ascii="Engravers MT" w:hAnsi="Engravers MT"/>
         </w:rPr>
-      </w:pPr>
-    </w:p>
-    <w:p>
-      <w:pPr>
-        <w:rPr>
-          <w:rFonts w:ascii="Engravers MT" w:hAnsi="Engravers MT"/>
-        </w:rPr>
-      </w:pPr>
+        <w:tab/>
+      </w:r>
     </w:p>
     <w:sectPr>
-      <w:headerReference w:type="even" r:id="rId9"/>
-      <w:headerReference w:type="default" r:id="rId10"/>
-      <w:headerReference w:type="first" r:id="rId11"/>
+      <w:headerReference w:type="even" r:id="rId11"/>
+      <w:headerReference w:type="default" r:id="rId12"/>
+      <w:headerReference w:type="first" r:id="rId13"/>
       <w:pgSz w:w="12240" w:h="18720" w:code="14"/>
       <w:pgMar w:top="720" w:right="720" w:bottom="810" w:left="720" w:header="708" w:footer="708" w:gutter="0"/>
       <w:cols w:space="708"/>
@@ -9198,6 +8541,7 @@
         </v:shapetype>
         <v:shape id="WordPictureWatermark11969282" o:spid="_x0000_s1026" type="#_x0000_t75" style="position:absolute;margin-left:0;margin-top:0;width:540pt;height:540pt;z-index:-251657216;mso-position-horizontal:center;mso-position-horizontal-relative:margin;mso-position-vertical:center;mso-position-vertical-relative:margin" o:allowincell="f">
           <v:imagedata r:id="rId1" o:title="DRANHS LOGO" gain="19661f" blacklevel="22938f"/>
+          <w10:wrap anchorx="margin" anchory="margin"/>
         </v:shape>
       </w:pict>
     </w:r>
@@ -9263,6 +8607,7 @@
         </v:shapetype>
         <v:shape id="WordPictureWatermark11969283" o:spid="_x0000_s1027" type="#_x0000_t75" style="position:absolute;margin-left:0;margin-top:0;width:540pt;height:540pt;z-index:-251656192;mso-position-horizontal:center;mso-position-horizontal-relative:margin;mso-position-vertical:center;mso-position-vertical-relative:margin" o:allowincell="f">
           <v:imagedata r:id="rId1" o:title="DRANHS LOGO" gain="19661f" blacklevel="22938f"/>
+          <w10:wrap anchorx="margin" anchory="margin"/>
         </v:shape>
       </w:pict>
     </w:r>
@@ -9302,6 +8647,7 @@
         </v:shapetype>
         <v:shape id="WordPictureWatermark11969281" o:spid="_x0000_s1025" type="#_x0000_t75" style="position:absolute;margin-left:0;margin-top:0;width:540pt;height:540pt;z-index:-251658240;mso-position-horizontal:center;mso-position-horizontal-relative:margin;mso-position-vertical:center;mso-position-vertical-relative:margin" o:allowincell="f">
           <v:imagedata r:id="rId1" o:title="DRANHS LOGO" gain="19661f" blacklevel="22938f"/>
+          <w10:wrap anchorx="margin" anchory="margin"/>
         </v:shape>
       </w:pict>
     </w:r>

</xml_diff>